<commit_message>
add storybook command to setup
</commit_message>
<xml_diff>
--- a/setup_instructions.docx
+++ b/setup_instructions.docx
@@ -1,76 +1,104 @@
 
 <file path=word/document.xml><?xml version="1.0" encoding="utf-8"?>
-<w:document xmlns:wpc="http://schemas.microsoft.com/office/word/2010/wordprocessingCanvas" xmlns:cx="http://schemas.microsoft.com/office/drawing/2014/chartex" xmlns:cx1="http://schemas.microsoft.com/office/drawing/2015/9/8/chartex" xmlns:cx2="http://schemas.microsoft.com/office/drawing/2015/10/21/chartex" xmlns:cx3="http://schemas.microsoft.com/office/drawing/2016/5/9/chartex" xmlns:cx4="http://schemas.microsoft.com/office/drawing/2016/5/10/chartex" xmlns:cx5="http://schemas.microsoft.com/office/drawing/2016/5/11/chartex" xmlns:cx6="http://schemas.microsoft.com/office/drawing/2016/5/12/chartex" xmlns:cx7="http://schemas.microsoft.com/office/drawing/2016/5/13/chartex" xmlns:cx8="http://schemas.microsoft.com/office/drawing/2016/5/14/chartex" xmlns:mc="http://schemas.openxmlformats.org/markup-compatibility/2006" xmlns:aink="http://schemas.microsoft.com/office/drawing/2016/ink" xmlns:am3d="http://schemas.microsoft.com/office/drawing/2017/model3d" xmlns:o="urn:schemas-microsoft-com:office:office" xmlns:oel="http://schemas.microsoft.com/office/2019/extlst" xmlns:r="http://schemas.openxmlformats.org/officeDocument/2006/relationships" xmlns:m="http://schemas.openxmlformats.org/officeDocument/2006/math" xmlns:v="urn:schemas-microsoft-com:vml" xmlns:wp14="http://schemas.microsoft.com/office/word/2010/wordprocessingDrawing" xmlns:wp="http://schemas.openxmlformats.org/drawingml/2006/wordprocessingDrawing" xmlns:w10="urn:schemas-microsoft-com:office:word" xmlns:w="http://schemas.openxmlformats.org/wordprocessingml/2006/main" xmlns:w14="http://schemas.microsoft.com/office/word/2010/wordml" xmlns:w15="http://schemas.microsoft.com/office/word/2012/wordml" xmlns:w16cex="http://schemas.microsoft.com/office/word/2018/wordml/cex" xmlns:w16cid="http://schemas.microsoft.com/office/word/2016/wordml/cid" xmlns:w16="http://schemas.microsoft.com/office/word/2018/wordml" xmlns:w16du="http://schemas.microsoft.com/office/word/2023/wordml/word16du" xmlns:w16sdtdh="http://schemas.microsoft.com/office/word/2020/wordml/sdtdatahash" xmlns:w16sdtfl="http://schemas.microsoft.com/office/word/2024/wordml/sdtformatlock" xmlns:w16se="http://schemas.microsoft.com/office/word/2015/wordml/symex" xmlns:wpg="http://schemas.microsoft.com/office/word/2010/wordprocessingGroup" xmlns:wpi="http://schemas.microsoft.com/office/word/2010/wordprocessingInk" xmlns:wne="http://schemas.microsoft.com/office/word/2006/wordml" xmlns:wps="http://schemas.microsoft.com/office/word/2010/wordprocessingShape" xmlns:a="http://schemas.openxmlformats.org/drawingml/2006/main" xmlns:pic="http://schemas.openxmlformats.org/drawingml/2006/picture" mc:Ignorable="w14 w15 w16se w16cid w16 w16cex w16sdtdh w16sdtfl w16du wp14">
+<w:document xmlns:wpc="http://schemas.microsoft.com/office/word/2010/wordprocessingCanvas" xmlns:cx="http://schemas.microsoft.com/office/drawing/2014/chartex" xmlns:cx1="http://schemas.microsoft.com/office/drawing/2015/9/8/chartex" xmlns:cx2="http://schemas.microsoft.com/office/drawing/2015/10/21/chartex" xmlns:cx3="http://schemas.microsoft.com/office/drawing/2016/5/9/chartex" xmlns:cx4="http://schemas.microsoft.com/office/drawing/2016/5/10/chartex" xmlns:cx5="http://schemas.microsoft.com/office/drawing/2016/5/11/chartex" xmlns:cx6="http://schemas.microsoft.com/office/drawing/2016/5/12/chartex" xmlns:cx7="http://schemas.microsoft.com/office/drawing/2016/5/13/chartex" xmlns:cx8="http://schemas.microsoft.com/office/drawing/2016/5/14/chartex" xmlns:mc="http://schemas.openxmlformats.org/markup-compatibility/2006" xmlns:aink="http://schemas.microsoft.com/office/drawing/2016/ink" xmlns:am3d="http://schemas.microsoft.com/office/drawing/2017/model3d" xmlns:o="urn:schemas-microsoft-com:office:office" xmlns:oel="http://schemas.microsoft.com/office/2019/extlst" xmlns:r="http://schemas.openxmlformats.org/officeDocument/2006/relationships" xmlns:m="http://schemas.openxmlformats.org/officeDocument/2006/math" xmlns:v="urn:schemas-microsoft-com:vml" xmlns:wp14="http://schemas.microsoft.com/office/word/2010/wordprocessingDrawing" xmlns:wp="http://schemas.openxmlformats.org/drawingml/2006/wordprocessingDrawing" xmlns:w10="urn:schemas-microsoft-com:office:word" xmlns:w="http://schemas.openxmlformats.org/wordprocessingml/2006/main" xmlns:w14="http://schemas.microsoft.com/office/word/2010/wordml" xmlns:w15="http://schemas.microsoft.com/office/word/2012/wordml" xmlns:w16cex="http://schemas.microsoft.com/office/word/2018/wordml/cex" xmlns:w16cid="http://schemas.microsoft.com/office/word/2016/wordml/cid" xmlns:w16="http://schemas.microsoft.com/office/word/2018/wordml" xmlns:w16du="http://schemas.microsoft.com/office/word/2023/wordml/word16du" xmlns:w16sdtdh="http://schemas.microsoft.com/office/word/2020/wordml/sdtdatahash" xmlns:w16sdtfl="http://schemas.microsoft.com/office/word/2024/wordml/sdtformatlock" xmlns:w16se="http://schemas.microsoft.com/office/word/2015/wordml/symex" xmlns:wpg="http://schemas.microsoft.com/office/word/2010/wordprocessingGroup" xmlns:wpi="http://schemas.microsoft.com/office/word/2010/wordprocessingInk" xmlns:wne="http://schemas.microsoft.com/office/word/2006/wordml" xmlns:wps="http://schemas.microsoft.com/office/word/2010/wordprocessingShape" mc:Ignorable="w14 w15 w16se w16cid w16 w16cex w16sdtdh w16sdtfl w16du wp14">
   <w:body>
-    <w:p xmlns:wp14="http://schemas.microsoft.com/office/word/2010/wordml" wp14:textId="77777777">
+    <w:p>
       <w:pPr>
         <w:ind w:left="720"/>
       </w:pPr>
     </w:p>
-    <w:p xmlns:wp14="http://schemas.microsoft.com/office/word/2010/wordml" wp14:textId="77777777">
+    <w:p>
       <w:pPr>
         <w:numPr>
           <w:ilvl w:val="0"/>
-          <w:numId w:val="2"/>
+          <w:numId w:val="5"/>
         </w:numPr>
       </w:pPr>
       <w:r>
         <w:t>Download Oracle Database</w:t>
       </w:r>
     </w:p>
-    <w:p xmlns:wp14="http://schemas.microsoft.com/office/word/2010/wordml" wp14:textId="77777777">
+    <w:p>
       <w:pPr>
         <w:numPr>
           <w:ilvl w:val="0"/>
-          <w:numId w:val="2"/>
+          <w:numId w:val="5"/>
         </w:numPr>
-        <w:rPr/>
-      </w:pPr>
-      <w:r>
-        <w:rPr>
-          <w:lang w:val="en-US"/>
-        </w:rPr>
-        <w:t>DownLoad sql Developer</w:t>
-      </w:r>
-    </w:p>
-    <w:p xmlns:wp14="http://schemas.microsoft.com/office/word/2010/wordml" wp14:textId="77777777">
+      </w:pPr>
+      <w:proofErr w:type="spellStart"/>
+      <w:r>
+        <w:rPr>
+          <w:lang w:val="en-US"/>
+        </w:rPr>
+        <w:t>DownLoad</w:t>
+      </w:r>
+      <w:proofErr w:type="spellEnd"/>
+      <w:r>
+        <w:rPr>
+          <w:lang w:val="en-US"/>
+        </w:rPr>
+        <w:t xml:space="preserve"> </w:t>
+      </w:r>
+      <w:proofErr w:type="spellStart"/>
+      <w:r>
+        <w:rPr>
+          <w:lang w:val="en-US"/>
+        </w:rPr>
+        <w:t>sql</w:t>
+      </w:r>
+      <w:proofErr w:type="spellEnd"/>
+      <w:r>
+        <w:rPr>
+          <w:lang w:val="en-US"/>
+        </w:rPr>
+        <w:t xml:space="preserve"> Developer</w:t>
+      </w:r>
+    </w:p>
+    <w:p>
       <w:pPr>
         <w:numPr>
           <w:ilvl w:val="0"/>
-          <w:numId w:val="2"/>
+          <w:numId w:val="5"/>
         </w:numPr>
       </w:pPr>
       <w:r>
         <w:t>Connect Oracle DB with SQL Developer</w:t>
       </w:r>
     </w:p>
-    <w:p xmlns:wp14="http://schemas.microsoft.com/office/word/2010/wordml" wp14:textId="77777777">
+    <w:p>
       <w:pPr>
         <w:numPr>
           <w:ilvl w:val="0"/>
-          <w:numId w:val="2"/>
+          <w:numId w:val="5"/>
         </w:numPr>
       </w:pPr>
       <w:r>
         <w:t>Download IntelliJ IDEA</w:t>
       </w:r>
     </w:p>
-    <w:p xmlns:wp14="http://schemas.microsoft.com/office/word/2010/wordml" wp14:textId="77777777">
+    <w:p>
       <w:pPr>
         <w:numPr>
           <w:ilvl w:val="0"/>
-          <w:numId w:val="2"/>
+          <w:numId w:val="5"/>
         </w:numPr>
-        <w:rPr/>
-      </w:pPr>
-      <w:r>
-        <w:rPr>
-          <w:lang w:val="en-US"/>
-        </w:rPr>
-        <w:t>Download code from following url</w:t>
-      </w:r>
-    </w:p>
-    <w:p xmlns:wp14="http://schemas.microsoft.com/office/word/2010/wordml" wp14:textId="77777777">
+      </w:pPr>
+      <w:r>
+        <w:rPr>
+          <w:lang w:val="en-US"/>
+        </w:rPr>
+        <w:t xml:space="preserve">Download code from following </w:t>
+      </w:r>
+      <w:proofErr w:type="spellStart"/>
+      <w:r>
+        <w:rPr>
+          <w:lang w:val="en-US"/>
+        </w:rPr>
+        <w:t>url</w:t>
+      </w:r>
+      <w:proofErr w:type="spellEnd"/>
+    </w:p>
+    <w:p>
       <w:pPr>
         <w:ind w:left="720"/>
         <w:rPr>
@@ -90,37 +118,133 @@
         </w:r>
       </w:hyperlink>
     </w:p>
-    <w:p xmlns:wp14="http://schemas.microsoft.com/office/word/2010/wordml" wp14:textId="77777777">
+    <w:p>
       <w:pPr>
         <w:numPr>
           <w:ilvl w:val="0"/>
-          <w:numId w:val="2"/>
+          <w:numId w:val="5"/>
         </w:numPr>
-        <w:rPr/>
-      </w:pPr>
-      <w:r>
-        <w:rPr>
-          <w:lang w:val="en-US"/>
-        </w:rPr>
-        <w:t>Run sql scripts(/src/main/resources/db_script/create_tables.sql) using sql developer</w:t>
-      </w:r>
-    </w:p>
-    <w:p xmlns:wp14="http://schemas.microsoft.com/office/word/2010/wordml" wp14:textId="77777777">
+      </w:pPr>
+      <w:r>
+        <w:rPr>
+          <w:lang w:val="en-US"/>
+        </w:rPr>
+        <w:t xml:space="preserve">Run </w:t>
+      </w:r>
+      <w:proofErr w:type="spellStart"/>
+      <w:r>
+        <w:rPr>
+          <w:lang w:val="en-US"/>
+        </w:rPr>
+        <w:t>sql</w:t>
+      </w:r>
+      <w:proofErr w:type="spellEnd"/>
+      <w:r>
+        <w:rPr>
+          <w:lang w:val="en-US"/>
+        </w:rPr>
+        <w:t xml:space="preserve"> scripts(/</w:t>
+      </w:r>
+      <w:proofErr w:type="spellStart"/>
+      <w:r>
+        <w:rPr>
+          <w:lang w:val="en-US"/>
+        </w:rPr>
+        <w:t>src</w:t>
+      </w:r>
+      <w:proofErr w:type="spellEnd"/>
+      <w:r>
+        <w:rPr>
+          <w:lang w:val="en-US"/>
+        </w:rPr>
+        <w:t>/main/resources/</w:t>
+      </w:r>
+      <w:proofErr w:type="spellStart"/>
+      <w:r>
+        <w:rPr>
+          <w:lang w:val="en-US"/>
+        </w:rPr>
+        <w:t>db_script</w:t>
+      </w:r>
+      <w:proofErr w:type="spellEnd"/>
+      <w:r>
+        <w:rPr>
+          <w:lang w:val="en-US"/>
+        </w:rPr>
+        <w:t>/</w:t>
+      </w:r>
+      <w:proofErr w:type="spellStart"/>
+      <w:r>
+        <w:rPr>
+          <w:lang w:val="en-US"/>
+        </w:rPr>
+        <w:t>create_tables.sql</w:t>
+      </w:r>
+      <w:proofErr w:type="spellEnd"/>
+      <w:r>
+        <w:rPr>
+          <w:lang w:val="en-US"/>
+        </w:rPr>
+        <w:t xml:space="preserve">) using </w:t>
+      </w:r>
+      <w:proofErr w:type="spellStart"/>
+      <w:r>
+        <w:rPr>
+          <w:lang w:val="en-US"/>
+        </w:rPr>
+        <w:t>sql</w:t>
+      </w:r>
+      <w:proofErr w:type="spellEnd"/>
+      <w:r>
+        <w:rPr>
+          <w:lang w:val="en-US"/>
+        </w:rPr>
+        <w:t xml:space="preserve"> developer</w:t>
+      </w:r>
+    </w:p>
+    <w:p>
       <w:pPr>
         <w:numPr>
           <w:ilvl w:val="0"/>
-          <w:numId w:val="2"/>
+          <w:numId w:val="5"/>
         </w:numPr>
-        <w:rPr/>
-      </w:pPr>
-      <w:r>
-        <w:rPr>
-          <w:lang w:val="en-US"/>
-        </w:rPr>
-        <w:t xml:space="preserve">In Intellija go to (File-&gt;Project Structure-&gt;Select JDK 17  ) </w:t>
-      </w:r>
-    </w:p>
-    <w:p xmlns:wp14="http://schemas.microsoft.com/office/word/2010/wordml" wp14:textId="77777777">
+      </w:pPr>
+      <w:r>
+        <w:rPr>
+          <w:lang w:val="en-US"/>
+        </w:rPr>
+        <w:t xml:space="preserve">In </w:t>
+      </w:r>
+      <w:proofErr w:type="spellStart"/>
+      <w:r>
+        <w:rPr>
+          <w:lang w:val="en-US"/>
+        </w:rPr>
+        <w:t>Intellija</w:t>
+      </w:r>
+      <w:proofErr w:type="spellEnd"/>
+      <w:r>
+        <w:rPr>
+          <w:lang w:val="en-US"/>
+        </w:rPr>
+        <w:t xml:space="preserve"> go to (File-&gt;Project Structure-&gt;Select JDK </w:t>
+      </w:r>
+      <w:proofErr w:type="gramStart"/>
+      <w:r>
+        <w:rPr>
+          <w:lang w:val="en-US"/>
+        </w:rPr>
+        <w:t>17  )</w:t>
+      </w:r>
+      <w:proofErr w:type="gramEnd"/>
+      <w:r>
+        <w:rPr>
+          <w:lang w:val="en-US"/>
+        </w:rPr>
+        <w:t xml:space="preserve"> </w:t>
+      </w:r>
+    </w:p>
+    <w:p>
       <w:pPr>
         <w:ind w:left="720"/>
       </w:pPr>
@@ -129,7 +253,7 @@
           <w:noProof/>
         </w:rPr>
         <w:drawing>
-          <wp:inline xmlns:wp14="http://schemas.microsoft.com/office/word/2010/wordprocessingDrawing" distT="114300" distB="114300" distL="114300" distR="114300" wp14:anchorId="34BC8BDE" wp14:editId="7777777">
+          <wp:inline distT="114300" distB="114300" distL="114300" distR="114300" wp14:anchorId="34BC8BDE" wp14:editId="07777777">
             <wp:extent cx="5943600" cy="4953000"/>
             <wp:effectExtent l="0" t="0" r="0" b="0"/>
             <wp:docPr id="2" name="image1.png"/>
@@ -165,33 +289,46 @@
         </w:drawing>
       </w:r>
     </w:p>
-    <w:p xmlns:wp14="http://schemas.microsoft.com/office/word/2010/wordml" wp14:textId="77777777">
+    <w:p>
       <w:pPr>
         <w:numPr>
           <w:ilvl w:val="0"/>
-          <w:numId w:val="2"/>
+          <w:numId w:val="5"/>
         </w:numPr>
       </w:pPr>
       <w:r>
         <w:t>Run Maven-&gt;Clean/Compile/Install</w:t>
       </w:r>
     </w:p>
-    <w:p xmlns:wp14="http://schemas.microsoft.com/office/word/2010/wordml" wp14:textId="77777777">
+    <w:p>
       <w:pPr>
         <w:numPr>
           <w:ilvl w:val="0"/>
-          <w:numId w:val="2"/>
+          <w:numId w:val="5"/>
         </w:numPr>
-        <w:rPr/>
-      </w:pPr>
-      <w:r>
-        <w:rPr>
-          <w:lang w:val="en-US"/>
-        </w:rPr>
-        <w:t>Run Spring Boot Application.(you will get following highlighted line if app run successfully</w:t>
-      </w:r>
-    </w:p>
-    <w:p xmlns:wp14="http://schemas.microsoft.com/office/word/2010/wordml" wp14:textId="77777777">
+      </w:pPr>
+      <w:r>
+        <w:rPr>
+          <w:lang w:val="en-US"/>
+        </w:rPr>
+        <w:t xml:space="preserve">Run Spring Boot </w:t>
+      </w:r>
+      <w:proofErr w:type="gramStart"/>
+      <w:r>
+        <w:rPr>
+          <w:lang w:val="en-US"/>
+        </w:rPr>
+        <w:t>Application.(</w:t>
+      </w:r>
+      <w:proofErr w:type="gramEnd"/>
+      <w:r>
+        <w:rPr>
+          <w:lang w:val="en-US"/>
+        </w:rPr>
+        <w:t>you will get following highlighted line if app run successfully</w:t>
+      </w:r>
+    </w:p>
+    <w:p>
       <w:pPr>
         <w:ind w:left="720"/>
       </w:pPr>
@@ -199,8 +336,9 @@
         <w:rPr>
           <w:noProof/>
         </w:rPr>
+        <w:lastRenderedPageBreak/>
         <w:drawing>
-          <wp:inline xmlns:wp14="http://schemas.microsoft.com/office/word/2010/wordprocessingDrawing" distT="114300" distB="114300" distL="114300" distR="114300" wp14:anchorId="5266A932" wp14:editId="7777777">
+          <wp:inline distT="114300" distB="114300" distL="114300" distR="114300" wp14:anchorId="5266A932" wp14:editId="07777777">
             <wp:extent cx="5943600" cy="1651000"/>
             <wp:effectExtent l="0" t="0" r="0" b="0"/>
             <wp:docPr id="1" name="image2.png"/>
@@ -236,11 +374,11 @@
         </w:drawing>
       </w:r>
     </w:p>
-    <w:p xmlns:wp14="http://schemas.microsoft.com/office/word/2010/wordml" wp14:textId="77777777">
+    <w:p>
       <w:pPr>
         <w:numPr>
           <w:ilvl w:val="0"/>
-          <w:numId w:val="2"/>
+          <w:numId w:val="5"/>
         </w:numPr>
       </w:pPr>
       <w:r>
@@ -256,18 +394,17 @@
         </w:r>
       </w:hyperlink>
     </w:p>
-    <w:p xmlns:wp14="http://schemas.microsoft.com/office/word/2010/wordml" wp14:textId="77777777">
+    <w:p>
       <w:pPr>
         <w:numPr>
           <w:ilvl w:val="0"/>
-          <w:numId w:val="2"/>
+          <w:numId w:val="5"/>
         </w:numPr>
-        <w:rPr/>
-      </w:pPr>
-      <w:r>
-        <w:rPr>
-          <w:b w:val="1"/>
-          <w:bCs w:val="1"/>
+      </w:pPr>
+      <w:r>
+        <w:rPr>
+          <w:b/>
+          <w:bCs/>
           <w:lang w:val="en-US"/>
         </w:rPr>
         <w:t>Download the LTS version</w:t>
@@ -278,14 +415,16 @@
         </w:rPr>
         <w:t xml:space="preserve"> (recommended for most users) — this includes </w:t>
       </w:r>
-      <w:r>
-        <w:rPr>
-          <w:rFonts w:ascii="Roboto Mono" w:hAnsi="Roboto Mono" w:eastAsia="Roboto Mono" w:cs="Roboto Mono"/>
+      <w:proofErr w:type="spellStart"/>
+      <w:r>
+        <w:rPr>
+          <w:rFonts w:ascii="Roboto Mono" w:eastAsia="Roboto Mono" w:hAnsi="Roboto Mono" w:cs="Roboto Mono"/>
           <w:color w:val="188038"/>
           <w:lang w:val="en-US"/>
         </w:rPr>
         <w:t>npm</w:t>
       </w:r>
+      <w:proofErr w:type="spellEnd"/>
       <w:r>
         <w:rPr>
           <w:lang w:val="en-US"/>
@@ -293,11 +432,11 @@
         <w:t xml:space="preserve"> (Node Package Manager).</w:t>
       </w:r>
     </w:p>
-    <w:p xmlns:wp14="http://schemas.microsoft.com/office/word/2010/wordml" wp14:textId="77777777">
+    <w:p>
       <w:pPr>
         <w:numPr>
           <w:ilvl w:val="0"/>
-          <w:numId w:val="2"/>
+          <w:numId w:val="5"/>
         </w:numPr>
       </w:pPr>
       <w:r>
@@ -307,33 +446,33 @@
         <w:t>Run the installer:</w:t>
       </w:r>
     </w:p>
-    <w:p xmlns:wp14="http://schemas.microsoft.com/office/word/2010/wordml" wp14:textId="77777777">
+    <w:p>
       <w:pPr>
         <w:numPr>
           <w:ilvl w:val="1"/>
-          <w:numId w:val="2"/>
+          <w:numId w:val="5"/>
         </w:numPr>
       </w:pPr>
       <w:r>
         <w:t>Accept the license</w:t>
       </w:r>
     </w:p>
-    <w:p xmlns:wp14="http://schemas.microsoft.com/office/word/2010/wordml" wp14:textId="77777777">
+    <w:p>
       <w:pPr>
         <w:numPr>
           <w:ilvl w:val="0"/>
-          <w:numId w:val="1"/>
+          <w:numId w:val="4"/>
         </w:numPr>
       </w:pPr>
       <w:r>
         <w:t>Click next on defaults</w:t>
       </w:r>
     </w:p>
-    <w:p xmlns:wp14="http://schemas.microsoft.com/office/word/2010/wordml" wp14:textId="77777777">
+    <w:p>
       <w:pPr>
         <w:numPr>
           <w:ilvl w:val="0"/>
-          <w:numId w:val="1"/>
+          <w:numId w:val="4"/>
         </w:numPr>
       </w:pPr>
       <w:r>
@@ -352,36 +491,71 @@
         <w:br/>
       </w:r>
     </w:p>
-    <w:p xmlns:wp14="http://schemas.microsoft.com/office/word/2010/wordml" wp14:textId="77777777">
+    <w:p>
       <w:pPr>
         <w:numPr>
           <w:ilvl w:val="0"/>
-          <w:numId w:val="2"/>
+          <w:numId w:val="5"/>
         </w:numPr>
         <w:spacing w:after="240"/>
-        <w:rPr/>
-      </w:pPr>
-      <w:r>
-        <w:rPr>
-          <w:b w:val="1"/>
-          <w:bCs w:val="1"/>
-          <w:lang w:val="en-US"/>
-        </w:rPr>
-        <w:t>Verify the installation:</w:t>
-      </w:r>
-      <w:r>
-        <w:rPr>
-          <w:lang w:val="en-US"/>
-        </w:rPr>
-        <w:t xml:space="preserve">Open </w:t>
-      </w:r>
-      <w:r>
-        <w:rPr>
-          <w:b w:val="1"/>
-          <w:bCs w:val="1"/>
-          <w:lang w:val="en-US"/>
-        </w:rPr>
-        <w:t>Command Prompt (cmd)</w:t>
+      </w:pPr>
+      <w:r>
+        <w:rPr>
+          <w:b/>
+          <w:bCs/>
+          <w:lang w:val="en-US"/>
+        </w:rPr>
+        <w:t xml:space="preserve">Verify the </w:t>
+      </w:r>
+      <w:proofErr w:type="spellStart"/>
+      <w:proofErr w:type="gramStart"/>
+      <w:r>
+        <w:rPr>
+          <w:b/>
+          <w:bCs/>
+          <w:lang w:val="en-US"/>
+        </w:rPr>
+        <w:t>installation:</w:t>
+      </w:r>
+      <w:r>
+        <w:rPr>
+          <w:lang w:val="en-US"/>
+        </w:rPr>
+        <w:t>Open</w:t>
+      </w:r>
+      <w:proofErr w:type="spellEnd"/>
+      <w:proofErr w:type="gramEnd"/>
+      <w:r>
+        <w:rPr>
+          <w:lang w:val="en-US"/>
+        </w:rPr>
+        <w:t xml:space="preserve"> </w:t>
+      </w:r>
+      <w:r>
+        <w:rPr>
+          <w:b/>
+          <w:bCs/>
+          <w:lang w:val="en-US"/>
+        </w:rPr>
+        <w:t>Command Prompt (</w:t>
+      </w:r>
+      <w:proofErr w:type="spellStart"/>
+      <w:r>
+        <w:rPr>
+          <w:b/>
+          <w:bCs/>
+          <w:lang w:val="en-US"/>
+        </w:rPr>
+        <w:t>cmd</w:t>
+      </w:r>
+      <w:proofErr w:type="spellEnd"/>
+      <w:r>
+        <w:rPr>
+          <w:b/>
+          <w:bCs/>
+          <w:lang w:val="en-US"/>
+        </w:rPr>
+        <w:t>)</w:t>
       </w:r>
       <w:r>
         <w:rPr>
@@ -390,7 +564,7 @@
         <w:t xml:space="preserve"> and run:</w:t>
       </w:r>
     </w:p>
-    <w:p xmlns:wp14="http://schemas.microsoft.com/office/word/2010/wordml" wp14:textId="77777777">
+    <w:p>
       <w:pPr>
         <w:spacing w:before="240" w:after="240"/>
         <w:ind w:left="720" w:firstLine="720"/>
@@ -399,23 +573,31 @@
         <w:t>node -v</w:t>
       </w:r>
     </w:p>
-    <w:p xmlns:wp14="http://schemas.microsoft.com/office/word/2010/wordml" wp14:textId="77777777">
+    <w:p>
       <w:pPr>
         <w:spacing w:before="240" w:after="240"/>
         <w:ind w:left="720" w:firstLine="720"/>
       </w:pPr>
-      <w:r>
-        <w:rPr>
-          <w:lang w:val="en-US"/>
-        </w:rPr>
-        <w:t>npm -v</w:t>
-      </w:r>
-    </w:p>
-    <w:p xmlns:wp14="http://schemas.microsoft.com/office/word/2010/wordml" wp14:textId="77777777">
+      <w:proofErr w:type="spellStart"/>
+      <w:r>
+        <w:rPr>
+          <w:lang w:val="en-US"/>
+        </w:rPr>
+        <w:t>npm</w:t>
+      </w:r>
+      <w:proofErr w:type="spellEnd"/>
+      <w:r>
+        <w:rPr>
+          <w:lang w:val="en-US"/>
+        </w:rPr>
+        <w:t xml:space="preserve"> -v</w:t>
+      </w:r>
+    </w:p>
+    <w:p>
       <w:pPr>
         <w:numPr>
           <w:ilvl w:val="0"/>
-          <w:numId w:val="2"/>
+          <w:numId w:val="5"/>
         </w:numPr>
         <w:spacing w:before="240" w:after="240"/>
       </w:pPr>
@@ -423,7 +605,7 @@
         <w:t xml:space="preserve"> You should see versions printed, like:</w:t>
       </w:r>
     </w:p>
-    <w:p xmlns:wp14="http://schemas.microsoft.com/office/word/2010/wordml" wp14:textId="77777777">
+    <w:p>
       <w:pPr>
         <w:spacing w:before="240" w:after="240"/>
         <w:ind w:left="720" w:firstLine="720"/>
@@ -432,7 +614,7 @@
         <w:t>V18.19.1</w:t>
       </w:r>
     </w:p>
-    <w:p xmlns:wp14="http://schemas.microsoft.com/office/word/2010/wordml" wp14:textId="77777777">
+    <w:p>
       <w:pPr>
         <w:spacing w:before="240" w:after="240"/>
         <w:ind w:left="720" w:firstLine="720"/>
@@ -441,11 +623,11 @@
         <w:t>9.8.0</w:t>
       </w:r>
     </w:p>
-    <w:p xmlns:wp14="http://schemas.microsoft.com/office/word/2010/wordml" wp14:textId="77777777">
+    <w:p>
       <w:pPr>
         <w:numPr>
           <w:ilvl w:val="0"/>
-          <w:numId w:val="2"/>
+          <w:numId w:val="5"/>
         </w:numPr>
         <w:spacing w:before="240" w:after="240"/>
       </w:pPr>
@@ -453,7 +635,7 @@
         <w:t xml:space="preserve">Navigate to your React frontend folder: </w:t>
       </w:r>
     </w:p>
-    <w:p xmlns:wp14="http://schemas.microsoft.com/office/word/2010/wordml" wp14:textId="77777777">
+    <w:p>
       <w:pPr>
         <w:spacing w:before="240" w:after="240"/>
         <w:ind w:left="720"/>
@@ -462,55 +644,162 @@
         <w:rPr>
           <w:lang w:val="en-US"/>
         </w:rPr>
-        <w:t>cd :/sentiment-analysis/stock-sentiment-ui</w:t>
-      </w:r>
-    </w:p>
-    <w:p xmlns:wp14="http://schemas.microsoft.com/office/word/2010/wordml" wp14:textId="77777777">
+        <w:t>cd :/sentiment-analysis/stock-sentiment-</w:t>
+      </w:r>
+      <w:proofErr w:type="spellStart"/>
+      <w:r>
+        <w:rPr>
+          <w:lang w:val="en-US"/>
+        </w:rPr>
+        <w:t>ui</w:t>
+      </w:r>
+      <w:proofErr w:type="spellEnd"/>
+    </w:p>
+    <w:p>
       <w:pPr>
         <w:numPr>
           <w:ilvl w:val="0"/>
-          <w:numId w:val="2"/>
+          <w:numId w:val="5"/>
         </w:numPr>
-        <w:rPr/>
-      </w:pPr>
-      <w:r>
-        <w:rPr>
-          <w:lang w:val="en-US"/>
-        </w:rPr>
-        <w:t>Run npm install</w:t>
-      </w:r>
-    </w:p>
-    <w:p xmlns:wp14="http://schemas.microsoft.com/office/word/2010/wordml" wp14:textId="77777777">
+      </w:pPr>
+      <w:r>
+        <w:rPr>
+          <w:lang w:val="en-US"/>
+        </w:rPr>
+        <w:t xml:space="preserve">Run </w:t>
+      </w:r>
+      <w:proofErr w:type="spellStart"/>
+      <w:r>
+        <w:rPr>
+          <w:lang w:val="en-US"/>
+        </w:rPr>
+        <w:t>npm</w:t>
+      </w:r>
+      <w:proofErr w:type="spellEnd"/>
+      <w:r>
+        <w:rPr>
+          <w:lang w:val="en-US"/>
+        </w:rPr>
+        <w:t xml:space="preserve"> install</w:t>
+      </w:r>
+    </w:p>
+    <w:p>
       <w:pPr>
         <w:numPr>
           <w:ilvl w:val="0"/>
-          <w:numId w:val="2"/>
+          <w:numId w:val="5"/>
         </w:numPr>
-        <w:rPr/>
-      </w:pPr>
-      <w:r>
-        <w:rPr>
-          <w:lang w:val="en-US"/>
-        </w:rPr>
-        <w:t>Run npm install axios react-chartjs-2 chart.js chartjs-plugin-datalabels</w:t>
-      </w:r>
-    </w:p>
-    <w:p xmlns:wp14="http://schemas.microsoft.com/office/word/2010/wordml" wp14:textId="77777777">
+      </w:pPr>
+      <w:r>
+        <w:rPr>
+          <w:lang w:val="en-US"/>
+        </w:rPr>
+        <w:t xml:space="preserve">Run </w:t>
+      </w:r>
+      <w:proofErr w:type="spellStart"/>
+      <w:r>
+        <w:rPr>
+          <w:lang w:val="en-US"/>
+        </w:rPr>
+        <w:t>npm</w:t>
+      </w:r>
+      <w:proofErr w:type="spellEnd"/>
+      <w:r>
+        <w:rPr>
+          <w:lang w:val="en-US"/>
+        </w:rPr>
+        <w:t xml:space="preserve"> install </w:t>
+      </w:r>
+      <w:proofErr w:type="spellStart"/>
+      <w:r>
+        <w:rPr>
+          <w:lang w:val="en-US"/>
+        </w:rPr>
+        <w:t>axios</w:t>
+      </w:r>
+      <w:proofErr w:type="spellEnd"/>
+      <w:r>
+        <w:rPr>
+          <w:lang w:val="en-US"/>
+        </w:rPr>
+        <w:t xml:space="preserve"> react-chartjs-2 chart.js </w:t>
+      </w:r>
+      <w:proofErr w:type="spellStart"/>
+      <w:r>
+        <w:rPr>
+          <w:lang w:val="en-US"/>
+        </w:rPr>
+        <w:t>chartjs</w:t>
+      </w:r>
+      <w:proofErr w:type="spellEnd"/>
+      <w:r>
+        <w:rPr>
+          <w:lang w:val="en-US"/>
+        </w:rPr>
+        <w:t>-plugin-</w:t>
+      </w:r>
+      <w:proofErr w:type="spellStart"/>
+      <w:r>
+        <w:rPr>
+          <w:lang w:val="en-US"/>
+        </w:rPr>
+        <w:t>datalabels</w:t>
+      </w:r>
+      <w:proofErr w:type="spellEnd"/>
+    </w:p>
+    <w:p>
       <w:pPr>
         <w:numPr>
           <w:ilvl w:val="0"/>
-          <w:numId w:val="2"/>
+          <w:numId w:val="5"/>
         </w:numPr>
-        <w:rPr/>
-      </w:pPr>
-      <w:r>
-        <w:rPr>
-          <w:lang w:val="en-US"/>
-        </w:rPr>
-        <w:t>npm start(This will start the React development server.App will open in your browser at:</w:t>
-      </w:r>
-    </w:p>
-    <w:p xmlns:wp14="http://schemas.microsoft.com/office/word/2010/wordml" wp14:textId="77777777">
+      </w:pPr>
+      <w:proofErr w:type="spellStart"/>
+      <w:r>
+        <w:rPr>
+          <w:lang w:val="en-US"/>
+        </w:rPr>
+        <w:t>npm</w:t>
+      </w:r>
+      <w:proofErr w:type="spellEnd"/>
+      <w:r>
+        <w:rPr>
+          <w:lang w:val="en-US"/>
+        </w:rPr>
+        <w:t xml:space="preserve"> </w:t>
+      </w:r>
+      <w:proofErr w:type="gramStart"/>
+      <w:r>
+        <w:rPr>
+          <w:lang w:val="en-US"/>
+        </w:rPr>
+        <w:t>start(</w:t>
+      </w:r>
+      <w:proofErr w:type="gramEnd"/>
+      <w:r>
+        <w:rPr>
+          <w:lang w:val="en-US"/>
+        </w:rPr>
+        <w:t xml:space="preserve">This will start the React development </w:t>
+      </w:r>
+      <w:proofErr w:type="spellStart"/>
+      <w:proofErr w:type="gramStart"/>
+      <w:r>
+        <w:rPr>
+          <w:lang w:val="en-US"/>
+        </w:rPr>
+        <w:t>server.App</w:t>
+      </w:r>
+      <w:proofErr w:type="spellEnd"/>
+      <w:proofErr w:type="gramEnd"/>
+      <w:r>
+        <w:rPr>
+          <w:lang w:val="en-US"/>
+        </w:rPr>
+        <w:t xml:space="preserve"> will open in your browser at:</w:t>
+      </w:r>
+    </w:p>
+    <w:p>
       <w:pPr>
         <w:ind w:left="720"/>
       </w:pPr>
@@ -524,19 +813,47 @@
         </w:r>
       </w:hyperlink>
     </w:p>
-    <w:p xmlns:wp14="http://schemas.microsoft.com/office/word/2010/wordml" wp14:textId="77777777"/>
-    <w:p xmlns:wp14="http://schemas.microsoft.com/office/word/2010/wordml" wp14:textId="77777777"/>
-    <w:p xmlns:wp14="http://schemas.microsoft.com/office/word/2010/wordml" wp14:textId="1AA59A23">
-      <w:pPr>
-        <w:rPr>
-          <w:b w:val="1"/>
-          <w:bCs w:val="1"/>
-        </w:rPr>
-      </w:pPr>
-      <w:r>
-        <w:rPr>
-          <w:b w:val="1"/>
-          <w:bCs w:val="1"/>
+    <w:p>
+      <w:pPr>
+        <w:pStyle w:val="ListParagraph"/>
+        <w:numPr>
+          <w:ilvl w:val="0"/>
+          <w:numId w:val="5"/>
+        </w:numPr>
+      </w:pPr>
+      <w:r>
+        <w:t xml:space="preserve">In another terminal Run </w:t>
+      </w:r>
+      <w:proofErr w:type="spellStart"/>
+      <w:r>
+        <w:rPr>
+          <w:i/>
+          <w:iCs/>
+        </w:rPr>
+        <w:t>npm</w:t>
+      </w:r>
+      <w:proofErr w:type="spellEnd"/>
+      <w:r>
+        <w:rPr>
+          <w:i/>
+          <w:iCs/>
+        </w:rPr>
+        <w:t xml:space="preserve"> run storybook</w:t>
+      </w:r>
+    </w:p>
+    <w:p/>
+    <w:p/>
+    <w:p>
+      <w:pPr>
+        <w:rPr>
+          <w:b/>
+          <w:bCs/>
+        </w:rPr>
+      </w:pPr>
+      <w:r>
+        <w:rPr>
+          <w:b/>
+          <w:bCs/>
         </w:rPr>
         <w:t>Setup For Kafka:</w:t>
       </w:r>
@@ -548,92 +865,41 @@
           <w:ilvl w:val="0"/>
           <w:numId w:val="3"/>
         </w:numPr>
-        <w:rPr>
-          <w:noProof w:val="0"/>
-          <w:lang w:val="en"/>
-        </w:rPr>
-      </w:pPr>
-      <w:r>
-        <w:rPr>
-          <w:noProof w:val="0"/>
-          <w:lang w:val="en"/>
-        </w:rPr>
+      </w:pPr>
+      <w:r>
         <w:t>Make Sure Docker Desktop is Installed</w:t>
       </w:r>
     </w:p>
     <w:p>
       <w:pPr>
         <w:pStyle w:val="ListParagraph"/>
-        <w:ind w:left="720"/>
-        <w:rPr>
-          <w:noProof w:val="0"/>
-          <w:lang w:val="en"/>
-        </w:rPr>
-      </w:pPr>
-      <w:r>
-        <w:rPr>
-          <w:noProof w:val="0"/>
-          <w:lang w:val="en-US"/>
-        </w:rPr>
-        <w:t>If</w:t>
-      </w:r>
-      <w:r>
-        <w:rPr>
-          <w:noProof w:val="0"/>
-          <w:lang w:val="en-US"/>
-        </w:rPr>
-        <w:t xml:space="preserve"> you </w:t>
-      </w:r>
-      <w:r>
-        <w:rPr>
-          <w:noProof w:val="0"/>
-          <w:lang w:val="en-US"/>
-        </w:rPr>
-        <w:t>haven’t</w:t>
-      </w:r>
-      <w:r>
-        <w:rPr>
-          <w:noProof w:val="0"/>
-          <w:lang w:val="en-US"/>
-        </w:rPr>
-        <w:t xml:space="preserve"> already:</w:t>
+      </w:pPr>
+      <w:r>
+        <w:rPr>
+          <w:lang w:val="en-US"/>
+        </w:rPr>
+        <w:t>If you haven’t already:</w:t>
       </w:r>
     </w:p>
     <w:p>
       <w:pPr>
         <w:pStyle w:val="ListParagraph"/>
-        <w:spacing w:before="240" w:beforeAutospacing="off" w:after="240" w:afterAutospacing="off"/>
-        <w:ind w:left="720"/>
-        <w:rPr>
-          <w:noProof w:val="0"/>
-          <w:sz w:val="22"/>
-          <w:szCs w:val="22"/>
-          <w:lang w:val="en"/>
-        </w:rPr>
-      </w:pPr>
-      <w:r>
-        <w:rPr>
-          <w:noProof w:val="0"/>
-          <w:lang w:val="en"/>
-        </w:rPr>
+        <w:spacing w:before="240" w:after="240"/>
+      </w:pPr>
+      <w:r>
+        <w:lastRenderedPageBreak/>
         <w:t>Download and install Docker Desktop for Windows from</w:t>
       </w:r>
       <w:r>
         <w:br/>
       </w:r>
       <w:r>
-        <w:rPr>
-          <w:noProof w:val="0"/>
-          <w:lang w:val="en"/>
-        </w:rPr>
         <w:t xml:space="preserve">  </w:t>
       </w:r>
-      <w:hyperlink r:id="R95699d9eab344966">
+      <w:hyperlink r:id="rId10">
         <w:r>
           <w:rPr>
             <w:rStyle w:val="Hyperlink"/>
-            <w:noProof w:val="0"/>
-            <w:lang w:val="en"/>
           </w:rPr>
           <w:t>https://www.docker.com/products/docker-desktop</w:t>
         </w:r>
@@ -646,151 +912,62 @@
           <w:ilvl w:val="0"/>
           <w:numId w:val="3"/>
         </w:numPr>
-        <w:rPr>
-          <w:b w:val="0"/>
-          <w:bCs w:val="0"/>
-          <w:noProof w:val="0"/>
-          <w:sz w:val="22"/>
-          <w:szCs w:val="22"/>
-          <w:lang w:val="en"/>
-        </w:rPr>
-      </w:pPr>
-      <w:r>
-        <w:rPr>
-          <w:b w:val="0"/>
-          <w:bCs w:val="0"/>
-          <w:noProof w:val="0"/>
-          <w:sz w:val="22"/>
-          <w:szCs w:val="22"/>
-          <w:lang w:val="en"/>
-        </w:rPr>
+      </w:pPr>
+      <w:r>
         <w:t>Start Docker Desktop</w:t>
       </w:r>
     </w:p>
     <w:p>
       <w:pPr>
         <w:pStyle w:val="ListParagraph"/>
-        <w:spacing w:before="240" w:beforeAutospacing="off" w:after="240" w:afterAutospacing="off"/>
-        <w:ind w:left="720"/>
-        <w:rPr>
-          <w:b w:val="0"/>
-          <w:bCs w:val="0"/>
-          <w:noProof w:val="0"/>
-          <w:sz w:val="22"/>
-          <w:szCs w:val="22"/>
-          <w:lang w:val="en"/>
-        </w:rPr>
-      </w:pPr>
-      <w:r>
-        <w:rPr>
-          <w:b w:val="0"/>
-          <w:bCs w:val="0"/>
-          <w:noProof w:val="0"/>
-          <w:lang w:val="en"/>
-        </w:rPr>
-        <w:t xml:space="preserve">Search for </w:t>
-      </w:r>
-      <w:r>
-        <w:rPr>
-          <w:b w:val="0"/>
-          <w:bCs w:val="0"/>
-          <w:noProof w:val="0"/>
-          <w:lang w:val="en"/>
-        </w:rPr>
-        <w:t>Docker Desktop</w:t>
-      </w:r>
-      <w:r>
-        <w:rPr>
-          <w:b w:val="0"/>
-          <w:bCs w:val="0"/>
-          <w:noProof w:val="0"/>
-          <w:lang w:val="en"/>
-        </w:rPr>
-        <w:t xml:space="preserve"> in the Start menu and open it.</w:t>
+        <w:spacing w:before="240" w:after="240"/>
+      </w:pPr>
+      <w:r>
+        <w:t>Search for Docker Desktop in the Start menu and open it.</w:t>
       </w:r>
     </w:p>
     <w:p>
       <w:pPr>
         <w:pStyle w:val="ListParagraph"/>
-        <w:spacing w:before="240" w:beforeAutospacing="off" w:after="240" w:afterAutospacing="off"/>
-        <w:ind w:left="720"/>
-        <w:rPr>
-          <w:b w:val="0"/>
-          <w:bCs w:val="0"/>
-          <w:noProof w:val="0"/>
-          <w:sz w:val="22"/>
-          <w:szCs w:val="22"/>
-          <w:lang w:val="en-US"/>
-        </w:rPr>
-      </w:pPr>
-      <w:r>
-        <w:rPr>
-          <w:b w:val="0"/>
-          <w:bCs w:val="0"/>
-          <w:noProof w:val="0"/>
-          <w:lang w:val="en-US"/>
-        </w:rPr>
-        <w:t>Wait until it finishes starting (</w:t>
-      </w:r>
-      <w:r>
-        <w:rPr>
-          <w:b w:val="0"/>
-          <w:bCs w:val="0"/>
-          <w:noProof w:val="0"/>
-          <w:lang w:val="en-US"/>
-        </w:rPr>
-        <w:t>you’ll</w:t>
-      </w:r>
-      <w:r>
-        <w:rPr>
-          <w:b w:val="0"/>
-          <w:bCs w:val="0"/>
-          <w:noProof w:val="0"/>
-          <w:lang w:val="en-US"/>
-        </w:rPr>
-        <w:t xml:space="preserve"> see a whale icon  in the system tray).</w:t>
+        <w:spacing w:before="240" w:after="240"/>
+        <w:rPr>
+          <w:lang w:val="en-US"/>
+        </w:rPr>
+      </w:pPr>
+      <w:r>
+        <w:rPr>
+          <w:lang w:val="en-US"/>
+        </w:rPr>
+        <w:t xml:space="preserve">Wait until it finishes starting (you’ll see a whale </w:t>
+      </w:r>
+      <w:proofErr w:type="gramStart"/>
+      <w:r>
+        <w:rPr>
+          <w:lang w:val="en-US"/>
+        </w:rPr>
+        <w:t>icon  in</w:t>
+      </w:r>
+      <w:proofErr w:type="gramEnd"/>
+      <w:r>
+        <w:rPr>
+          <w:lang w:val="en-US"/>
+        </w:rPr>
+        <w:t xml:space="preserve"> the system tray).</w:t>
       </w:r>
     </w:p>
     <w:p>
       <w:pPr>
         <w:pStyle w:val="ListParagraph"/>
-        <w:spacing w:before="240" w:beforeAutospacing="off" w:after="240" w:afterAutospacing="off"/>
-        <w:ind w:left="720"/>
-        <w:rPr>
-          <w:b w:val="0"/>
-          <w:bCs w:val="0"/>
-          <w:noProof w:val="0"/>
-          <w:sz w:val="22"/>
-          <w:szCs w:val="22"/>
-          <w:lang w:val="en-US"/>
-        </w:rPr>
-      </w:pPr>
-      <w:r>
-        <w:rPr>
-          <w:b w:val="0"/>
-          <w:bCs w:val="0"/>
-          <w:noProof w:val="0"/>
-          <w:lang w:val="en-US"/>
-        </w:rPr>
-        <w:t xml:space="preserve">Hover over the whale icon to confirm </w:t>
-      </w:r>
-      <w:r>
-        <w:rPr>
-          <w:b w:val="0"/>
-          <w:bCs w:val="0"/>
-          <w:noProof w:val="0"/>
-          <w:lang w:val="en-US"/>
-        </w:rPr>
-        <w:t>it's</w:t>
-      </w:r>
-      <w:r>
-        <w:rPr>
-          <w:b w:val="0"/>
-          <w:bCs w:val="0"/>
-          <w:noProof w:val="0"/>
-          <w:lang w:val="en-US"/>
-        </w:rPr>
-        <w:t xml:space="preserve"> running (it may say "Docker is running").</w:t>
+        <w:spacing w:before="240" w:after="240"/>
+        <w:rPr>
+          <w:lang w:val="en-US"/>
+        </w:rPr>
+      </w:pPr>
+      <w:r>
+        <w:rPr>
+          <w:lang w:val="en-US"/>
+        </w:rPr>
+        <w:t>Hover over the whale icon to confirm it's running (it may say "Docker is running").</w:t>
       </w:r>
     </w:p>
     <w:p>
@@ -800,19 +977,13 @@
           <w:ilvl w:val="0"/>
           <w:numId w:val="3"/>
         </w:numPr>
-        <w:rPr>
-          <w:noProof w:val="0"/>
-          <w:lang w:val="en"/>
-        </w:rPr>
-      </w:pPr>
-      <w:r>
-        <w:rPr>
-          <w:b w:val="1"/>
-          <w:bCs w:val="1"/>
-          <w:noProof w:val="0"/>
+      </w:pPr>
+      <w:r>
+        <w:rPr>
+          <w:b/>
+          <w:bCs/>
           <w:sz w:val="28"/>
           <w:szCs w:val="28"/>
-          <w:lang w:val="en"/>
         </w:rPr>
         <w:t>Start Kafka and Zookeeper</w:t>
       </w:r>
@@ -820,41 +991,35 @@
     <w:p>
       <w:pPr>
         <w:pStyle w:val="ListParagraph"/>
-        <w:spacing w:before="240" w:beforeAutospacing="off" w:after="240" w:afterAutospacing="off"/>
-        <w:ind w:left="720"/>
-        <w:rPr>
-          <w:noProof w:val="0"/>
-          <w:sz w:val="22"/>
-          <w:szCs w:val="22"/>
-          <w:lang w:val="en-US"/>
-        </w:rPr>
-      </w:pPr>
-      <w:r>
-        <w:rPr>
-          <w:noProof w:val="0"/>
+        <w:spacing w:before="240" w:after="240"/>
+        <w:rPr>
+          <w:lang w:val="en-US"/>
+        </w:rPr>
+      </w:pPr>
+      <w:r>
+        <w:rPr>
           <w:lang w:val="en-US"/>
         </w:rPr>
         <w:t xml:space="preserve">Open your terminal in the folder with this </w:t>
       </w:r>
       <w:r>
         <w:rPr>
-          <w:rFonts w:ascii="Consolas" w:hAnsi="Consolas" w:eastAsia="Consolas" w:cs="Consolas"/>
-          <w:noProof w:val="0"/>
+          <w:rFonts w:ascii="Consolas" w:eastAsia="Consolas" w:hAnsi="Consolas" w:cs="Consolas"/>
           <w:lang w:val="en-US"/>
         </w:rPr>
         <w:t>docker-</w:t>
       </w:r>
-      <w:r>
-        <w:rPr>
-          <w:rFonts w:ascii="Consolas" w:hAnsi="Consolas" w:eastAsia="Consolas" w:cs="Consolas"/>
-          <w:noProof w:val="0"/>
+      <w:proofErr w:type="spellStart"/>
+      <w:r>
+        <w:rPr>
+          <w:rFonts w:ascii="Consolas" w:eastAsia="Consolas" w:hAnsi="Consolas" w:cs="Consolas"/>
           <w:lang w:val="en-US"/>
         </w:rPr>
         <w:t>compose.yml</w:t>
       </w:r>
-      <w:r>
-        <w:rPr>
-          <w:noProof w:val="0"/>
+      <w:proofErr w:type="spellEnd"/>
+      <w:r>
+        <w:rPr>
           <w:lang w:val="en-US"/>
         </w:rPr>
         <w:t xml:space="preserve"> and run:</w:t>
@@ -863,20 +1028,14 @@
     <w:p>
       <w:pPr>
         <w:pStyle w:val="ListParagraph"/>
-        <w:spacing w:before="0" w:beforeAutospacing="off" w:after="0" w:afterAutospacing="off"/>
-        <w:ind w:left="720"/>
-        <w:rPr>
-          <w:rFonts w:ascii="Consolas" w:hAnsi="Consolas" w:eastAsia="Consolas" w:cs="Consolas"/>
-          <w:noProof w:val="0"/>
-          <w:sz w:val="22"/>
-          <w:szCs w:val="22"/>
-          <w:lang w:val="en-US"/>
-        </w:rPr>
-      </w:pPr>
-      <w:r>
-        <w:rPr>
-          <w:rFonts w:ascii="Consolas" w:hAnsi="Consolas" w:eastAsia="Consolas" w:cs="Consolas"/>
-          <w:noProof w:val="0"/>
+        <w:rPr>
+          <w:rFonts w:ascii="Consolas" w:eastAsia="Consolas" w:hAnsi="Consolas" w:cs="Consolas"/>
+          <w:lang w:val="en-US"/>
+        </w:rPr>
+      </w:pPr>
+      <w:r>
+        <w:rPr>
+          <w:rFonts w:ascii="Consolas" w:eastAsia="Consolas" w:hAnsi="Consolas" w:cs="Consolas"/>
           <w:lang w:val="en-US"/>
         </w:rPr>
         <w:t>docker-compose up -d</w:t>
@@ -885,11 +1044,8 @@
     <w:p>
       <w:pPr>
         <w:pStyle w:val="ListParagraph"/>
-        <w:spacing w:before="0" w:beforeAutospacing="off" w:after="0" w:afterAutospacing="off"/>
-        <w:ind w:left="720"/>
-        <w:rPr>
-          <w:rFonts w:ascii="Consolas" w:hAnsi="Consolas" w:eastAsia="Consolas" w:cs="Consolas"/>
-          <w:noProof w:val="0"/>
+        <w:rPr>
+          <w:rFonts w:ascii="Consolas" w:eastAsia="Consolas" w:hAnsi="Consolas" w:cs="Consolas"/>
           <w:lang w:val="en-US"/>
         </w:rPr>
       </w:pPr>
@@ -901,38 +1057,21 @@
           <w:ilvl w:val="0"/>
           <w:numId w:val="3"/>
         </w:numPr>
-        <w:rPr>
-          <w:noProof w:val="0"/>
-          <w:lang w:val="en"/>
-        </w:rPr>
-      </w:pPr>
-      <w:r>
-        <w:rPr>
-          <w:noProof w:val="0"/>
-          <w:lang w:val="en"/>
-        </w:rPr>
+      </w:pPr>
+      <w:r>
         <w:t>To stop containers, run:</w:t>
       </w:r>
     </w:p>
     <w:p>
       <w:pPr>
         <w:pStyle w:val="ListParagraph"/>
-        <w:ind w:left="720"/>
-        <w:rPr>
-          <w:noProof w:val="0"/>
-          <w:lang w:val="en"/>
-        </w:rPr>
-      </w:pPr>
-      <w:r>
-        <w:rPr>
-          <w:noProof w:val="0"/>
-          <w:lang w:val="en"/>
-        </w:rPr>
+      </w:pPr>
+      <w:r>
         <w:t>docker-compose down</w:t>
       </w:r>
     </w:p>
     <w:sectPr>
-      <w:pgSz w:w="12240" w:h="15840" w:orient="portrait"/>
+      <w:pgSz w:w="12240" w:h="15840"/>
       <w:pgMar w:top="1440" w:right="1440" w:bottom="1440" w:left="1440" w:header="720" w:footer="720" w:gutter="0"/>
       <w:pgNumType w:start="1"/>
       <w:cols w:space="720"/>
@@ -943,315 +1082,6 @@
 
 <file path=word/numbering.xml><?xml version="1.0" encoding="utf-8"?>
 <w:numbering xmlns:wpc="http://schemas.microsoft.com/office/word/2010/wordprocessingCanvas" xmlns:cx="http://schemas.microsoft.com/office/drawing/2014/chartex" xmlns:cx1="http://schemas.microsoft.com/office/drawing/2015/9/8/chartex" xmlns:cx2="http://schemas.microsoft.com/office/drawing/2015/10/21/chartex" xmlns:cx3="http://schemas.microsoft.com/office/drawing/2016/5/9/chartex" xmlns:cx4="http://schemas.microsoft.com/office/drawing/2016/5/10/chartex" xmlns:cx5="http://schemas.microsoft.com/office/drawing/2016/5/11/chartex" xmlns:cx6="http://schemas.microsoft.com/office/drawing/2016/5/12/chartex" xmlns:cx7="http://schemas.microsoft.com/office/drawing/2016/5/13/chartex" xmlns:cx8="http://schemas.microsoft.com/office/drawing/2016/5/14/chartex" xmlns:mc="http://schemas.openxmlformats.org/markup-compatibility/2006" xmlns:aink="http://schemas.microsoft.com/office/drawing/2016/ink" xmlns:am3d="http://schemas.microsoft.com/office/drawing/2017/model3d" xmlns:o="urn:schemas-microsoft-com:office:office" xmlns:oel="http://schemas.microsoft.com/office/2019/extlst" xmlns:r="http://schemas.openxmlformats.org/officeDocument/2006/relationships" xmlns:m="http://schemas.openxmlformats.org/officeDocument/2006/math" xmlns:v="urn:schemas-microsoft-com:vml" xmlns:wp14="http://schemas.microsoft.com/office/word/2010/wordprocessingDrawing" xmlns:wp="http://schemas.openxmlformats.org/drawingml/2006/wordprocessingDrawing" xmlns:w10="urn:schemas-microsoft-com:office:word" xmlns:w="http://schemas.openxmlformats.org/wordprocessingml/2006/main" xmlns:w14="http://schemas.microsoft.com/office/word/2010/wordml" xmlns:w15="http://schemas.microsoft.com/office/word/2012/wordml" xmlns:w16cex="http://schemas.microsoft.com/office/word/2018/wordml/cex" xmlns:w16cid="http://schemas.microsoft.com/office/word/2016/wordml/cid" xmlns:w16="http://schemas.microsoft.com/office/word/2018/wordml" xmlns:w16du="http://schemas.microsoft.com/office/word/2023/wordml/word16du" xmlns:w16sdtdh="http://schemas.microsoft.com/office/word/2020/wordml/sdtdatahash" xmlns:w16sdtfl="http://schemas.microsoft.com/office/word/2024/wordml/sdtformatlock" xmlns:w16se="http://schemas.microsoft.com/office/word/2015/wordml/symex" xmlns:wpg="http://schemas.microsoft.com/office/word/2010/wordprocessingGroup" xmlns:wpi="http://schemas.microsoft.com/office/word/2010/wordprocessingInk" xmlns:wne="http://schemas.microsoft.com/office/word/2006/wordml" xmlns:wps="http://schemas.microsoft.com/office/word/2010/wordprocessingShape" mc:Ignorable="w14 w15 w16se w16cid w16 w16cex w16sdtdh w16sdtfl w16du wp14">
-  <w:abstractNum xmlns:w="http://schemas.openxmlformats.org/wordprocessingml/2006/main" w:abstractNumId="4">
-    <w:nsid w:val="523f24ca"/>
-    <w:multiLevelType xmlns:w="http://schemas.openxmlformats.org/wordprocessingml/2006/main" w:val="hybridMultilevel"/>
-    <w:lvl xmlns:w="http://schemas.openxmlformats.org/wordprocessingml/2006/main" w:ilvl="0">
-      <w:start w:val="1"/>
-      <w:numFmt w:val="bullet"/>
-      <w:lvlText w:val=""/>
-      <w:lvlJc w:val="left"/>
-      <w:pPr>
-        <w:ind w:left="720" w:hanging="360"/>
-      </w:pPr>
-      <w:rPr>
-        <w:rFonts w:hint="default" w:ascii="Symbol" w:hAnsi="Symbol"/>
-      </w:rPr>
-    </w:lvl>
-    <w:lvl xmlns:w="http://schemas.openxmlformats.org/wordprocessingml/2006/main" w:ilvl="1">
-      <w:start w:val="1"/>
-      <w:numFmt w:val="bullet"/>
-      <w:lvlText w:val="o"/>
-      <w:lvlJc w:val="left"/>
-      <w:pPr>
-        <w:ind w:left="1440" w:hanging="360"/>
-      </w:pPr>
-      <w:rPr>
-        <w:rFonts w:hint="default" w:ascii="Courier New" w:hAnsi="Courier New"/>
-      </w:rPr>
-    </w:lvl>
-    <w:lvl xmlns:w="http://schemas.openxmlformats.org/wordprocessingml/2006/main" w:ilvl="2">
-      <w:start w:val="1"/>
-      <w:numFmt w:val="bullet"/>
-      <w:lvlText w:val=""/>
-      <w:lvlJc w:val="left"/>
-      <w:pPr>
-        <w:ind w:left="2160" w:hanging="360"/>
-      </w:pPr>
-      <w:rPr>
-        <w:rFonts w:hint="default" w:ascii="Wingdings" w:hAnsi="Wingdings"/>
-      </w:rPr>
-    </w:lvl>
-    <w:lvl xmlns:w="http://schemas.openxmlformats.org/wordprocessingml/2006/main" w:ilvl="3">
-      <w:start w:val="1"/>
-      <w:numFmt w:val="bullet"/>
-      <w:lvlText w:val=""/>
-      <w:lvlJc w:val="left"/>
-      <w:pPr>
-        <w:ind w:left="2880" w:hanging="360"/>
-      </w:pPr>
-      <w:rPr>
-        <w:rFonts w:hint="default" w:ascii="Symbol" w:hAnsi="Symbol"/>
-      </w:rPr>
-    </w:lvl>
-    <w:lvl xmlns:w="http://schemas.openxmlformats.org/wordprocessingml/2006/main" w:ilvl="4">
-      <w:start w:val="1"/>
-      <w:numFmt w:val="bullet"/>
-      <w:lvlText w:val="o"/>
-      <w:lvlJc w:val="left"/>
-      <w:pPr>
-        <w:ind w:left="3600" w:hanging="360"/>
-      </w:pPr>
-      <w:rPr>
-        <w:rFonts w:hint="default" w:ascii="Courier New" w:hAnsi="Courier New"/>
-      </w:rPr>
-    </w:lvl>
-    <w:lvl xmlns:w="http://schemas.openxmlformats.org/wordprocessingml/2006/main" w:ilvl="5">
-      <w:start w:val="1"/>
-      <w:numFmt w:val="bullet"/>
-      <w:lvlText w:val=""/>
-      <w:lvlJc w:val="left"/>
-      <w:pPr>
-        <w:ind w:left="4320" w:hanging="360"/>
-      </w:pPr>
-      <w:rPr>
-        <w:rFonts w:hint="default" w:ascii="Wingdings" w:hAnsi="Wingdings"/>
-      </w:rPr>
-    </w:lvl>
-    <w:lvl xmlns:w="http://schemas.openxmlformats.org/wordprocessingml/2006/main" w:ilvl="6">
-      <w:start w:val="1"/>
-      <w:numFmt w:val="bullet"/>
-      <w:lvlText w:val=""/>
-      <w:lvlJc w:val="left"/>
-      <w:pPr>
-        <w:ind w:left="5040" w:hanging="360"/>
-      </w:pPr>
-      <w:rPr>
-        <w:rFonts w:hint="default" w:ascii="Symbol" w:hAnsi="Symbol"/>
-      </w:rPr>
-    </w:lvl>
-    <w:lvl xmlns:w="http://schemas.openxmlformats.org/wordprocessingml/2006/main" w:ilvl="7">
-      <w:start w:val="1"/>
-      <w:numFmt w:val="bullet"/>
-      <w:lvlText w:val="o"/>
-      <w:lvlJc w:val="left"/>
-      <w:pPr>
-        <w:ind w:left="5760" w:hanging="360"/>
-      </w:pPr>
-      <w:rPr>
-        <w:rFonts w:hint="default" w:ascii="Courier New" w:hAnsi="Courier New"/>
-      </w:rPr>
-    </w:lvl>
-    <w:lvl xmlns:w="http://schemas.openxmlformats.org/wordprocessingml/2006/main" w:ilvl="8">
-      <w:start w:val="1"/>
-      <w:numFmt w:val="bullet"/>
-      <w:lvlText w:val=""/>
-      <w:lvlJc w:val="left"/>
-      <w:pPr>
-        <w:ind w:left="6480" w:hanging="360"/>
-      </w:pPr>
-      <w:rPr>
-        <w:rFonts w:hint="default" w:ascii="Wingdings" w:hAnsi="Wingdings"/>
-      </w:rPr>
-    </w:lvl>
-  </w:abstractNum>
-  <w:abstractNum xmlns:w="http://schemas.openxmlformats.org/wordprocessingml/2006/main" w:abstractNumId="3">
-    <w:nsid w:val="506f5416"/>
-    <w:multiLevelType xmlns:w="http://schemas.openxmlformats.org/wordprocessingml/2006/main" w:val="hybridMultilevel"/>
-    <w:lvl xmlns:w="http://schemas.openxmlformats.org/wordprocessingml/2006/main" w:ilvl="0">
-      <w:start w:val="1"/>
-      <w:numFmt w:val="bullet"/>
-      <w:lvlText w:val=""/>
-      <w:lvlJc w:val="left"/>
-      <w:pPr>
-        <w:ind w:left="720" w:hanging="360"/>
-      </w:pPr>
-      <w:rPr>
-        <w:rFonts w:hint="default" w:ascii="Symbol" w:hAnsi="Symbol"/>
-      </w:rPr>
-    </w:lvl>
-    <w:lvl xmlns:w="http://schemas.openxmlformats.org/wordprocessingml/2006/main" w:ilvl="1">
-      <w:start w:val="1"/>
-      <w:numFmt w:val="bullet"/>
-      <w:lvlText w:val="o"/>
-      <w:lvlJc w:val="left"/>
-      <w:pPr>
-        <w:ind w:left="1440" w:hanging="360"/>
-      </w:pPr>
-      <w:rPr>
-        <w:rFonts w:hint="default" w:ascii="Courier New" w:hAnsi="Courier New"/>
-      </w:rPr>
-    </w:lvl>
-    <w:lvl xmlns:w="http://schemas.openxmlformats.org/wordprocessingml/2006/main" w:ilvl="2">
-      <w:start w:val="1"/>
-      <w:numFmt w:val="bullet"/>
-      <w:lvlText w:val=""/>
-      <w:lvlJc w:val="left"/>
-      <w:pPr>
-        <w:ind w:left="2160" w:hanging="360"/>
-      </w:pPr>
-      <w:rPr>
-        <w:rFonts w:hint="default" w:ascii="Wingdings" w:hAnsi="Wingdings"/>
-      </w:rPr>
-    </w:lvl>
-    <w:lvl xmlns:w="http://schemas.openxmlformats.org/wordprocessingml/2006/main" w:ilvl="3">
-      <w:start w:val="1"/>
-      <w:numFmt w:val="bullet"/>
-      <w:lvlText w:val=""/>
-      <w:lvlJc w:val="left"/>
-      <w:pPr>
-        <w:ind w:left="2880" w:hanging="360"/>
-      </w:pPr>
-      <w:rPr>
-        <w:rFonts w:hint="default" w:ascii="Symbol" w:hAnsi="Symbol"/>
-      </w:rPr>
-    </w:lvl>
-    <w:lvl xmlns:w="http://schemas.openxmlformats.org/wordprocessingml/2006/main" w:ilvl="4">
-      <w:start w:val="1"/>
-      <w:numFmt w:val="bullet"/>
-      <w:lvlText w:val="o"/>
-      <w:lvlJc w:val="left"/>
-      <w:pPr>
-        <w:ind w:left="3600" w:hanging="360"/>
-      </w:pPr>
-      <w:rPr>
-        <w:rFonts w:hint="default" w:ascii="Courier New" w:hAnsi="Courier New"/>
-      </w:rPr>
-    </w:lvl>
-    <w:lvl xmlns:w="http://schemas.openxmlformats.org/wordprocessingml/2006/main" w:ilvl="5">
-      <w:start w:val="1"/>
-      <w:numFmt w:val="bullet"/>
-      <w:lvlText w:val=""/>
-      <w:lvlJc w:val="left"/>
-      <w:pPr>
-        <w:ind w:left="4320" w:hanging="360"/>
-      </w:pPr>
-      <w:rPr>
-        <w:rFonts w:hint="default" w:ascii="Wingdings" w:hAnsi="Wingdings"/>
-      </w:rPr>
-    </w:lvl>
-    <w:lvl xmlns:w="http://schemas.openxmlformats.org/wordprocessingml/2006/main" w:ilvl="6">
-      <w:start w:val="1"/>
-      <w:numFmt w:val="bullet"/>
-      <w:lvlText w:val=""/>
-      <w:lvlJc w:val="left"/>
-      <w:pPr>
-        <w:ind w:left="5040" w:hanging="360"/>
-      </w:pPr>
-      <w:rPr>
-        <w:rFonts w:hint="default" w:ascii="Symbol" w:hAnsi="Symbol"/>
-      </w:rPr>
-    </w:lvl>
-    <w:lvl xmlns:w="http://schemas.openxmlformats.org/wordprocessingml/2006/main" w:ilvl="7">
-      <w:start w:val="1"/>
-      <w:numFmt w:val="bullet"/>
-      <w:lvlText w:val="o"/>
-      <w:lvlJc w:val="left"/>
-      <w:pPr>
-        <w:ind w:left="5760" w:hanging="360"/>
-      </w:pPr>
-      <w:rPr>
-        <w:rFonts w:hint="default" w:ascii="Courier New" w:hAnsi="Courier New"/>
-      </w:rPr>
-    </w:lvl>
-    <w:lvl xmlns:w="http://schemas.openxmlformats.org/wordprocessingml/2006/main" w:ilvl="8">
-      <w:start w:val="1"/>
-      <w:numFmt w:val="bullet"/>
-      <w:lvlText w:val=""/>
-      <w:lvlJc w:val="left"/>
-      <w:pPr>
-        <w:ind w:left="6480" w:hanging="360"/>
-      </w:pPr>
-      <w:rPr>
-        <w:rFonts w:hint="default" w:ascii="Wingdings" w:hAnsi="Wingdings"/>
-      </w:rPr>
-    </w:lvl>
-  </w:abstractNum>
-  <w:abstractNum xmlns:w="http://schemas.openxmlformats.org/wordprocessingml/2006/main" w:abstractNumId="2">
-    <w:nsid w:val="4bfff409"/>
-    <w:multiLevelType xmlns:w="http://schemas.openxmlformats.org/wordprocessingml/2006/main" w:val="hybridMultilevel"/>
-    <w:lvl xmlns:w="http://schemas.openxmlformats.org/wordprocessingml/2006/main" w:ilvl="0">
-      <w:start w:val="1"/>
-      <w:numFmt w:val="decimal"/>
-      <w:lvlText w:val="%1."/>
-      <w:lvlJc w:val="left"/>
-      <w:pPr>
-        <w:ind w:left="720" w:hanging="360"/>
-      </w:pPr>
-    </w:lvl>
-    <w:lvl xmlns:w="http://schemas.openxmlformats.org/wordprocessingml/2006/main" w:ilvl="1">
-      <w:start w:val="1"/>
-      <w:numFmt w:val="lowerLetter"/>
-      <w:lvlText w:val="%2."/>
-      <w:lvlJc w:val="left"/>
-      <w:pPr>
-        <w:ind w:left="1440" w:hanging="360"/>
-      </w:pPr>
-    </w:lvl>
-    <w:lvl xmlns:w="http://schemas.openxmlformats.org/wordprocessingml/2006/main" w:ilvl="2">
-      <w:start w:val="1"/>
-      <w:numFmt w:val="lowerRoman"/>
-      <w:lvlText w:val="%3."/>
-      <w:lvlJc w:val="right"/>
-      <w:pPr>
-        <w:ind w:left="2160" w:hanging="180"/>
-      </w:pPr>
-    </w:lvl>
-    <w:lvl xmlns:w="http://schemas.openxmlformats.org/wordprocessingml/2006/main" w:ilvl="3">
-      <w:start w:val="1"/>
-      <w:numFmt w:val="decimal"/>
-      <w:lvlText w:val="%4."/>
-      <w:lvlJc w:val="left"/>
-      <w:pPr>
-        <w:ind w:left="2880" w:hanging="360"/>
-      </w:pPr>
-    </w:lvl>
-    <w:lvl xmlns:w="http://schemas.openxmlformats.org/wordprocessingml/2006/main" w:ilvl="4">
-      <w:start w:val="1"/>
-      <w:numFmt w:val="lowerLetter"/>
-      <w:lvlText w:val="%5."/>
-      <w:lvlJc w:val="left"/>
-      <w:pPr>
-        <w:ind w:left="3600" w:hanging="360"/>
-      </w:pPr>
-    </w:lvl>
-    <w:lvl xmlns:w="http://schemas.openxmlformats.org/wordprocessingml/2006/main" w:ilvl="5">
-      <w:start w:val="1"/>
-      <w:numFmt w:val="lowerRoman"/>
-      <w:lvlText w:val="%6."/>
-      <w:lvlJc w:val="right"/>
-      <w:pPr>
-        <w:ind w:left="4320" w:hanging="180"/>
-      </w:pPr>
-    </w:lvl>
-    <w:lvl xmlns:w="http://schemas.openxmlformats.org/wordprocessingml/2006/main" w:ilvl="6">
-      <w:start w:val="1"/>
-      <w:numFmt w:val="decimal"/>
-      <w:lvlText w:val="%7."/>
-      <w:lvlJc w:val="left"/>
-      <w:pPr>
-        <w:ind w:left="5040" w:hanging="360"/>
-      </w:pPr>
-    </w:lvl>
-    <w:lvl xmlns:w="http://schemas.openxmlformats.org/wordprocessingml/2006/main" w:ilvl="7">
-      <w:start w:val="1"/>
-      <w:numFmt w:val="lowerLetter"/>
-      <w:lvlText w:val="%8."/>
-      <w:lvlJc w:val="left"/>
-      <w:pPr>
-        <w:ind w:left="5760" w:hanging="360"/>
-      </w:pPr>
-    </w:lvl>
-    <w:lvl xmlns:w="http://schemas.openxmlformats.org/wordprocessingml/2006/main" w:ilvl="8">
-      <w:start w:val="1"/>
-      <w:numFmt w:val="lowerRoman"/>
-      <w:lvlText w:val="%9."/>
-      <w:lvlJc w:val="right"/>
-      <w:pPr>
-        <w:ind w:left="6480" w:hanging="180"/>
-      </w:pPr>
-    </w:lvl>
-  </w:abstractNum>
   <w:abstractNum w:abstractNumId="0" w15:restartNumberingAfterBreak="0">
     <w:nsid w:val="3558237D"/>
     <w:multiLevelType w:val="multilevel"/>
@@ -1478,30 +1308,342 @@
       </w:rPr>
     </w:lvl>
   </w:abstractNum>
-  <w:num w:numId="5">
+  <w:abstractNum w:abstractNumId="2" w15:restartNumberingAfterBreak="0">
+    <w:nsid w:val="4BFFF409"/>
+    <w:multiLevelType w:val="hybridMultilevel"/>
+    <w:tmpl w:val="4E00E194"/>
+    <w:lvl w:ilvl="0" w:tplc="6BC85F4A">
+      <w:start w:val="1"/>
+      <w:numFmt w:val="decimal"/>
+      <w:lvlText w:val="%1."/>
+      <w:lvlJc w:val="left"/>
+      <w:pPr>
+        <w:ind w:left="720" w:hanging="360"/>
+      </w:pPr>
+    </w:lvl>
+    <w:lvl w:ilvl="1" w:tplc="23327EBC">
+      <w:start w:val="1"/>
+      <w:numFmt w:val="lowerLetter"/>
+      <w:lvlText w:val="%2."/>
+      <w:lvlJc w:val="left"/>
+      <w:pPr>
+        <w:ind w:left="1440" w:hanging="360"/>
+      </w:pPr>
+    </w:lvl>
+    <w:lvl w:ilvl="2" w:tplc="8646B3AA">
+      <w:start w:val="1"/>
+      <w:numFmt w:val="lowerRoman"/>
+      <w:lvlText w:val="%3."/>
+      <w:lvlJc w:val="right"/>
+      <w:pPr>
+        <w:ind w:left="2160" w:hanging="180"/>
+      </w:pPr>
+    </w:lvl>
+    <w:lvl w:ilvl="3" w:tplc="301AD800">
+      <w:start w:val="1"/>
+      <w:numFmt w:val="decimal"/>
+      <w:lvlText w:val="%4."/>
+      <w:lvlJc w:val="left"/>
+      <w:pPr>
+        <w:ind w:left="2880" w:hanging="360"/>
+      </w:pPr>
+    </w:lvl>
+    <w:lvl w:ilvl="4" w:tplc="1192938A">
+      <w:start w:val="1"/>
+      <w:numFmt w:val="lowerLetter"/>
+      <w:lvlText w:val="%5."/>
+      <w:lvlJc w:val="left"/>
+      <w:pPr>
+        <w:ind w:left="3600" w:hanging="360"/>
+      </w:pPr>
+    </w:lvl>
+    <w:lvl w:ilvl="5" w:tplc="B136E99C">
+      <w:start w:val="1"/>
+      <w:numFmt w:val="lowerRoman"/>
+      <w:lvlText w:val="%6."/>
+      <w:lvlJc w:val="right"/>
+      <w:pPr>
+        <w:ind w:left="4320" w:hanging="180"/>
+      </w:pPr>
+    </w:lvl>
+    <w:lvl w:ilvl="6" w:tplc="8C08B4C0">
+      <w:start w:val="1"/>
+      <w:numFmt w:val="decimal"/>
+      <w:lvlText w:val="%7."/>
+      <w:lvlJc w:val="left"/>
+      <w:pPr>
+        <w:ind w:left="5040" w:hanging="360"/>
+      </w:pPr>
+    </w:lvl>
+    <w:lvl w:ilvl="7" w:tplc="C570D61A">
+      <w:start w:val="1"/>
+      <w:numFmt w:val="lowerLetter"/>
+      <w:lvlText w:val="%8."/>
+      <w:lvlJc w:val="left"/>
+      <w:pPr>
+        <w:ind w:left="5760" w:hanging="360"/>
+      </w:pPr>
+    </w:lvl>
+    <w:lvl w:ilvl="8" w:tplc="294007A8">
+      <w:start w:val="1"/>
+      <w:numFmt w:val="lowerRoman"/>
+      <w:lvlText w:val="%9."/>
+      <w:lvlJc w:val="right"/>
+      <w:pPr>
+        <w:ind w:left="6480" w:hanging="180"/>
+      </w:pPr>
+    </w:lvl>
+  </w:abstractNum>
+  <w:abstractNum w:abstractNumId="3" w15:restartNumberingAfterBreak="0">
+    <w:nsid w:val="506F5416"/>
+    <w:multiLevelType w:val="hybridMultilevel"/>
+    <w:tmpl w:val="7136AE4E"/>
+    <w:lvl w:ilvl="0" w:tplc="7FF20C4A">
+      <w:start w:val="1"/>
+      <w:numFmt w:val="bullet"/>
+      <w:lvlText w:val=""/>
+      <w:lvlJc w:val="left"/>
+      <w:pPr>
+        <w:ind w:left="720" w:hanging="360"/>
+      </w:pPr>
+      <w:rPr>
+        <w:rFonts w:ascii="Symbol" w:hAnsi="Symbol" w:hint="default"/>
+      </w:rPr>
+    </w:lvl>
+    <w:lvl w:ilvl="1" w:tplc="BACEFC22">
+      <w:start w:val="1"/>
+      <w:numFmt w:val="bullet"/>
+      <w:lvlText w:val="o"/>
+      <w:lvlJc w:val="left"/>
+      <w:pPr>
+        <w:ind w:left="1440" w:hanging="360"/>
+      </w:pPr>
+      <w:rPr>
+        <w:rFonts w:ascii="Courier New" w:hAnsi="Courier New" w:hint="default"/>
+      </w:rPr>
+    </w:lvl>
+    <w:lvl w:ilvl="2" w:tplc="535A1FEE">
+      <w:start w:val="1"/>
+      <w:numFmt w:val="bullet"/>
+      <w:lvlText w:val=""/>
+      <w:lvlJc w:val="left"/>
+      <w:pPr>
+        <w:ind w:left="2160" w:hanging="360"/>
+      </w:pPr>
+      <w:rPr>
+        <w:rFonts w:ascii="Wingdings" w:hAnsi="Wingdings" w:hint="default"/>
+      </w:rPr>
+    </w:lvl>
+    <w:lvl w:ilvl="3" w:tplc="6750041A">
+      <w:start w:val="1"/>
+      <w:numFmt w:val="bullet"/>
+      <w:lvlText w:val=""/>
+      <w:lvlJc w:val="left"/>
+      <w:pPr>
+        <w:ind w:left="2880" w:hanging="360"/>
+      </w:pPr>
+      <w:rPr>
+        <w:rFonts w:ascii="Symbol" w:hAnsi="Symbol" w:hint="default"/>
+      </w:rPr>
+    </w:lvl>
+    <w:lvl w:ilvl="4" w:tplc="BE985162">
+      <w:start w:val="1"/>
+      <w:numFmt w:val="bullet"/>
+      <w:lvlText w:val="o"/>
+      <w:lvlJc w:val="left"/>
+      <w:pPr>
+        <w:ind w:left="3600" w:hanging="360"/>
+      </w:pPr>
+      <w:rPr>
+        <w:rFonts w:ascii="Courier New" w:hAnsi="Courier New" w:hint="default"/>
+      </w:rPr>
+    </w:lvl>
+    <w:lvl w:ilvl="5" w:tplc="8F2636CA">
+      <w:start w:val="1"/>
+      <w:numFmt w:val="bullet"/>
+      <w:lvlText w:val=""/>
+      <w:lvlJc w:val="left"/>
+      <w:pPr>
+        <w:ind w:left="4320" w:hanging="360"/>
+      </w:pPr>
+      <w:rPr>
+        <w:rFonts w:ascii="Wingdings" w:hAnsi="Wingdings" w:hint="default"/>
+      </w:rPr>
+    </w:lvl>
+    <w:lvl w:ilvl="6" w:tplc="54908640">
+      <w:start w:val="1"/>
+      <w:numFmt w:val="bullet"/>
+      <w:lvlText w:val=""/>
+      <w:lvlJc w:val="left"/>
+      <w:pPr>
+        <w:ind w:left="5040" w:hanging="360"/>
+      </w:pPr>
+      <w:rPr>
+        <w:rFonts w:ascii="Symbol" w:hAnsi="Symbol" w:hint="default"/>
+      </w:rPr>
+    </w:lvl>
+    <w:lvl w:ilvl="7" w:tplc="E53A71BE">
+      <w:start w:val="1"/>
+      <w:numFmt w:val="bullet"/>
+      <w:lvlText w:val="o"/>
+      <w:lvlJc w:val="left"/>
+      <w:pPr>
+        <w:ind w:left="5760" w:hanging="360"/>
+      </w:pPr>
+      <w:rPr>
+        <w:rFonts w:ascii="Courier New" w:hAnsi="Courier New" w:hint="default"/>
+      </w:rPr>
+    </w:lvl>
+    <w:lvl w:ilvl="8" w:tplc="EEB40A46">
+      <w:start w:val="1"/>
+      <w:numFmt w:val="bullet"/>
+      <w:lvlText w:val=""/>
+      <w:lvlJc w:val="left"/>
+      <w:pPr>
+        <w:ind w:left="6480" w:hanging="360"/>
+      </w:pPr>
+      <w:rPr>
+        <w:rFonts w:ascii="Wingdings" w:hAnsi="Wingdings" w:hint="default"/>
+      </w:rPr>
+    </w:lvl>
+  </w:abstractNum>
+  <w:abstractNum w:abstractNumId="4" w15:restartNumberingAfterBreak="0">
+    <w:nsid w:val="523F24CA"/>
+    <w:multiLevelType w:val="hybridMultilevel"/>
+    <w:tmpl w:val="D6F28736"/>
+    <w:lvl w:ilvl="0" w:tplc="CAA812A2">
+      <w:start w:val="1"/>
+      <w:numFmt w:val="bullet"/>
+      <w:lvlText w:val=""/>
+      <w:lvlJc w:val="left"/>
+      <w:pPr>
+        <w:ind w:left="720" w:hanging="360"/>
+      </w:pPr>
+      <w:rPr>
+        <w:rFonts w:ascii="Symbol" w:hAnsi="Symbol" w:hint="default"/>
+      </w:rPr>
+    </w:lvl>
+    <w:lvl w:ilvl="1" w:tplc="29C28088">
+      <w:start w:val="1"/>
+      <w:numFmt w:val="bullet"/>
+      <w:lvlText w:val="o"/>
+      <w:lvlJc w:val="left"/>
+      <w:pPr>
+        <w:ind w:left="1440" w:hanging="360"/>
+      </w:pPr>
+      <w:rPr>
+        <w:rFonts w:ascii="Courier New" w:hAnsi="Courier New" w:hint="default"/>
+      </w:rPr>
+    </w:lvl>
+    <w:lvl w:ilvl="2" w:tplc="4C42EA76">
+      <w:start w:val="1"/>
+      <w:numFmt w:val="bullet"/>
+      <w:lvlText w:val=""/>
+      <w:lvlJc w:val="left"/>
+      <w:pPr>
+        <w:ind w:left="2160" w:hanging="360"/>
+      </w:pPr>
+      <w:rPr>
+        <w:rFonts w:ascii="Wingdings" w:hAnsi="Wingdings" w:hint="default"/>
+      </w:rPr>
+    </w:lvl>
+    <w:lvl w:ilvl="3" w:tplc="5B1E0366">
+      <w:start w:val="1"/>
+      <w:numFmt w:val="bullet"/>
+      <w:lvlText w:val=""/>
+      <w:lvlJc w:val="left"/>
+      <w:pPr>
+        <w:ind w:left="2880" w:hanging="360"/>
+      </w:pPr>
+      <w:rPr>
+        <w:rFonts w:ascii="Symbol" w:hAnsi="Symbol" w:hint="default"/>
+      </w:rPr>
+    </w:lvl>
+    <w:lvl w:ilvl="4" w:tplc="C176702E">
+      <w:start w:val="1"/>
+      <w:numFmt w:val="bullet"/>
+      <w:lvlText w:val="o"/>
+      <w:lvlJc w:val="left"/>
+      <w:pPr>
+        <w:ind w:left="3600" w:hanging="360"/>
+      </w:pPr>
+      <w:rPr>
+        <w:rFonts w:ascii="Courier New" w:hAnsi="Courier New" w:hint="default"/>
+      </w:rPr>
+    </w:lvl>
+    <w:lvl w:ilvl="5" w:tplc="0974113A">
+      <w:start w:val="1"/>
+      <w:numFmt w:val="bullet"/>
+      <w:lvlText w:val=""/>
+      <w:lvlJc w:val="left"/>
+      <w:pPr>
+        <w:ind w:left="4320" w:hanging="360"/>
+      </w:pPr>
+      <w:rPr>
+        <w:rFonts w:ascii="Wingdings" w:hAnsi="Wingdings" w:hint="default"/>
+      </w:rPr>
+    </w:lvl>
+    <w:lvl w:ilvl="6" w:tplc="47085FCE">
+      <w:start w:val="1"/>
+      <w:numFmt w:val="bullet"/>
+      <w:lvlText w:val=""/>
+      <w:lvlJc w:val="left"/>
+      <w:pPr>
+        <w:ind w:left="5040" w:hanging="360"/>
+      </w:pPr>
+      <w:rPr>
+        <w:rFonts w:ascii="Symbol" w:hAnsi="Symbol" w:hint="default"/>
+      </w:rPr>
+    </w:lvl>
+    <w:lvl w:ilvl="7" w:tplc="B678CC10">
+      <w:start w:val="1"/>
+      <w:numFmt w:val="bullet"/>
+      <w:lvlText w:val="o"/>
+      <w:lvlJc w:val="left"/>
+      <w:pPr>
+        <w:ind w:left="5760" w:hanging="360"/>
+      </w:pPr>
+      <w:rPr>
+        <w:rFonts w:ascii="Courier New" w:hAnsi="Courier New" w:hint="default"/>
+      </w:rPr>
+    </w:lvl>
+    <w:lvl w:ilvl="8" w:tplc="216ED504">
+      <w:start w:val="1"/>
+      <w:numFmt w:val="bullet"/>
+      <w:lvlText w:val=""/>
+      <w:lvlJc w:val="left"/>
+      <w:pPr>
+        <w:ind w:left="6480" w:hanging="360"/>
+      </w:pPr>
+      <w:rPr>
+        <w:rFonts w:ascii="Wingdings" w:hAnsi="Wingdings" w:hint="default"/>
+      </w:rPr>
+    </w:lvl>
+  </w:abstractNum>
+  <w:num w:numId="1" w16cid:durableId="405569237">
     <w:abstractNumId w:val="4"/>
   </w:num>
-  <w:num w:numId="4">
+  <w:num w:numId="2" w16cid:durableId="1671758311">
     <w:abstractNumId w:val="3"/>
   </w:num>
-  <w:num w:numId="3">
+  <w:num w:numId="3" w16cid:durableId="1784348902">
     <w:abstractNumId w:val="2"/>
   </w:num>
-  <w:num w:numId="1" w16cid:durableId="14426064">
+  <w:num w:numId="4" w16cid:durableId="14426064">
     <w:abstractNumId w:val="1"/>
   </w:num>
-  <w:num w:numId="2" w16cid:durableId="1111973377">
+  <w:num w:numId="5" w16cid:durableId="1111973377">
     <w:abstractNumId w:val="0"/>
   </w:num>
 </w:numbering>
 </file>
 
 <file path=word/styles.xml><?xml version="1.0" encoding="utf-8"?>
-<w:styles xmlns:wp14="http://schemas.microsoft.com/office/word/2010/wordprocessingDrawing" xmlns:mc="http://schemas.openxmlformats.org/markup-compatibility/2006" xmlns:r="http://schemas.openxmlformats.org/officeDocument/2006/relationships" xmlns:w="http://schemas.openxmlformats.org/wordprocessingml/2006/main" xmlns:w14="http://schemas.microsoft.com/office/word/2010/wordml" xmlns:w15="http://schemas.microsoft.com/office/word/2012/wordml" xmlns:w16cex="http://schemas.microsoft.com/office/word/2018/wordml/cex" xmlns:w16cid="http://schemas.microsoft.com/office/word/2016/wordml/cid" xmlns:w16="http://schemas.microsoft.com/office/word/2018/wordml" xmlns:w16du="http://schemas.microsoft.com/office/word/2023/wordml/word16du" xmlns:w16sdtdh="http://schemas.microsoft.com/office/word/2020/wordml/sdtdatahash" xmlns:w16sdtfl="http://schemas.microsoft.com/office/word/2024/wordml/sdtformatlock" xmlns:w16se="http://schemas.microsoft.com/office/word/2015/wordml/symex" mc:Ignorable="w14 w15 w16se w16cid w16 w16cex w16sdtdh w16sdtfl w16du wp14">
+<w:styles xmlns:mc="http://schemas.openxmlformats.org/markup-compatibility/2006" xmlns:r="http://schemas.openxmlformats.org/officeDocument/2006/relationships" xmlns:w="http://schemas.openxmlformats.org/wordprocessingml/2006/main" xmlns:w14="http://schemas.microsoft.com/office/word/2010/wordml" xmlns:w15="http://schemas.microsoft.com/office/word/2012/wordml" xmlns:w16cex="http://schemas.microsoft.com/office/word/2018/wordml/cex" xmlns:w16cid="http://schemas.microsoft.com/office/word/2016/wordml/cid" xmlns:w16="http://schemas.microsoft.com/office/word/2018/wordml" xmlns:w16du="http://schemas.microsoft.com/office/word/2023/wordml/word16du" xmlns:w16sdtdh="http://schemas.microsoft.com/office/word/2020/wordml/sdtdatahash" xmlns:w16sdtfl="http://schemas.microsoft.com/office/word/2024/wordml/sdtformatlock" xmlns:w16se="http://schemas.microsoft.com/office/word/2015/wordml/symex" mc:Ignorable="w14 w15 w16se w16cid w16 w16cex w16sdtdh w16sdtfl w16du">
   <w:docDefaults>
     <w:rPrDefault>
       <w:rPr>
-        <w:rFonts w:ascii="Arial" w:hAnsi="Arial" w:eastAsia="Arial" w:cs="Arial"/>
+        <w:rFonts w:ascii="Arial" w:eastAsia="Arial" w:hAnsi="Arial" w:cs="Arial"/>
         <w:sz w:val="22"/>
         <w:szCs w:val="22"/>
         <w:lang w:val="en" w:eastAsia="ja-JP" w:bidi="ar-SA"/>
@@ -1516,14 +1658,14 @@
   <w:latentStyles w:defLockedState="0" w:defUIPriority="99" w:defSemiHidden="0" w:defUnhideWhenUsed="0" w:defQFormat="0" w:count="376">
     <w:lsdException w:name="Normal" w:uiPriority="0" w:qFormat="1"/>
     <w:lsdException w:name="heading 1" w:uiPriority="9" w:qFormat="1"/>
-    <w:lsdException w:name="heading 2" w:uiPriority="9" w:semiHidden="1" w:unhideWhenUsed="1" w:qFormat="1"/>
-    <w:lsdException w:name="heading 3" w:uiPriority="9" w:semiHidden="1" w:unhideWhenUsed="1" w:qFormat="1"/>
-    <w:lsdException w:name="heading 4" w:uiPriority="9" w:semiHidden="1" w:unhideWhenUsed="1" w:qFormat="1"/>
-    <w:lsdException w:name="heading 5" w:uiPriority="9" w:semiHidden="1" w:unhideWhenUsed="1" w:qFormat="1"/>
-    <w:lsdException w:name="heading 6" w:uiPriority="9" w:semiHidden="1" w:unhideWhenUsed="1" w:qFormat="1"/>
-    <w:lsdException w:name="heading 7" w:uiPriority="9" w:semiHidden="1" w:unhideWhenUsed="1" w:qFormat="1"/>
-    <w:lsdException w:name="heading 8" w:uiPriority="9" w:semiHidden="1" w:unhideWhenUsed="1" w:qFormat="1"/>
-    <w:lsdException w:name="heading 9" w:uiPriority="9" w:semiHidden="1" w:unhideWhenUsed="1" w:qFormat="1"/>
+    <w:lsdException w:name="heading 2" w:semiHidden="1" w:uiPriority="9" w:unhideWhenUsed="1" w:qFormat="1"/>
+    <w:lsdException w:name="heading 3" w:semiHidden="1" w:uiPriority="9" w:unhideWhenUsed="1" w:qFormat="1"/>
+    <w:lsdException w:name="heading 4" w:semiHidden="1" w:uiPriority="9" w:unhideWhenUsed="1" w:qFormat="1"/>
+    <w:lsdException w:name="heading 5" w:semiHidden="1" w:uiPriority="9" w:unhideWhenUsed="1" w:qFormat="1"/>
+    <w:lsdException w:name="heading 6" w:semiHidden="1" w:uiPriority="9" w:unhideWhenUsed="1" w:qFormat="1"/>
+    <w:lsdException w:name="heading 7" w:semiHidden="1" w:uiPriority="9" w:unhideWhenUsed="1" w:qFormat="1"/>
+    <w:lsdException w:name="heading 8" w:semiHidden="1" w:uiPriority="9" w:unhideWhenUsed="1" w:qFormat="1"/>
+    <w:lsdException w:name="heading 9" w:semiHidden="1" w:uiPriority="9" w:unhideWhenUsed="1" w:qFormat="1"/>
     <w:lsdException w:name="index 1" w:semiHidden="1" w:unhideWhenUsed="1"/>
     <w:lsdException w:name="index 2" w:semiHidden="1" w:unhideWhenUsed="1"/>
     <w:lsdException w:name="index 3" w:semiHidden="1" w:unhideWhenUsed="1"/>
@@ -1533,22 +1675,22 @@
     <w:lsdException w:name="index 7" w:semiHidden="1" w:unhideWhenUsed="1"/>
     <w:lsdException w:name="index 8" w:semiHidden="1" w:unhideWhenUsed="1"/>
     <w:lsdException w:name="index 9" w:semiHidden="1" w:unhideWhenUsed="1"/>
-    <w:lsdException w:name="toc 1" w:uiPriority="39" w:semiHidden="1" w:unhideWhenUsed="1"/>
-    <w:lsdException w:name="toc 2" w:uiPriority="39" w:semiHidden="1" w:unhideWhenUsed="1"/>
-    <w:lsdException w:name="toc 3" w:uiPriority="39" w:semiHidden="1" w:unhideWhenUsed="1"/>
-    <w:lsdException w:name="toc 4" w:uiPriority="39" w:semiHidden="1" w:unhideWhenUsed="1"/>
-    <w:lsdException w:name="toc 5" w:uiPriority="39" w:semiHidden="1" w:unhideWhenUsed="1"/>
-    <w:lsdException w:name="toc 6" w:uiPriority="39" w:semiHidden="1" w:unhideWhenUsed="1"/>
-    <w:lsdException w:name="toc 7" w:uiPriority="39" w:semiHidden="1" w:unhideWhenUsed="1"/>
-    <w:lsdException w:name="toc 8" w:uiPriority="39" w:semiHidden="1" w:unhideWhenUsed="1"/>
-    <w:lsdException w:name="toc 9" w:uiPriority="39" w:semiHidden="1" w:unhideWhenUsed="1"/>
+    <w:lsdException w:name="toc 1" w:semiHidden="1" w:uiPriority="39" w:unhideWhenUsed="1"/>
+    <w:lsdException w:name="toc 2" w:semiHidden="1" w:uiPriority="39" w:unhideWhenUsed="1"/>
+    <w:lsdException w:name="toc 3" w:semiHidden="1" w:uiPriority="39" w:unhideWhenUsed="1"/>
+    <w:lsdException w:name="toc 4" w:semiHidden="1" w:uiPriority="39" w:unhideWhenUsed="1"/>
+    <w:lsdException w:name="toc 5" w:semiHidden="1" w:uiPriority="39" w:unhideWhenUsed="1"/>
+    <w:lsdException w:name="toc 6" w:semiHidden="1" w:uiPriority="39" w:unhideWhenUsed="1"/>
+    <w:lsdException w:name="toc 7" w:semiHidden="1" w:uiPriority="39" w:unhideWhenUsed="1"/>
+    <w:lsdException w:name="toc 8" w:semiHidden="1" w:uiPriority="39" w:unhideWhenUsed="1"/>
+    <w:lsdException w:name="toc 9" w:semiHidden="1" w:uiPriority="39" w:unhideWhenUsed="1"/>
     <w:lsdException w:name="Normal Indent" w:semiHidden="1" w:unhideWhenUsed="1"/>
     <w:lsdException w:name="footnote text" w:semiHidden="1" w:unhideWhenUsed="1"/>
     <w:lsdException w:name="annotation text" w:semiHidden="1" w:unhideWhenUsed="1"/>
     <w:lsdException w:name="header" w:semiHidden="1" w:unhideWhenUsed="1"/>
     <w:lsdException w:name="footer" w:semiHidden="1" w:unhideWhenUsed="1"/>
     <w:lsdException w:name="index heading" w:semiHidden="1" w:unhideWhenUsed="1"/>
-    <w:lsdException w:name="caption" w:uiPriority="35" w:semiHidden="1" w:unhideWhenUsed="1" w:qFormat="1"/>
+    <w:lsdException w:name="caption" w:semiHidden="1" w:uiPriority="35" w:unhideWhenUsed="1" w:qFormat="1"/>
     <w:lsdException w:name="table of figures" w:semiHidden="1" w:unhideWhenUsed="1"/>
     <w:lsdException w:name="envelope address" w:semiHidden="1" w:unhideWhenUsed="1"/>
     <w:lsdException w:name="envelope return" w:semiHidden="1" w:unhideWhenUsed="1"/>
@@ -1579,7 +1721,7 @@
     <w:lsdException w:name="Title" w:uiPriority="10" w:qFormat="1"/>
     <w:lsdException w:name="Closing" w:semiHidden="1" w:unhideWhenUsed="1"/>
     <w:lsdException w:name="Signature" w:semiHidden="1" w:unhideWhenUsed="1"/>
-    <w:lsdException w:name="Default Paragraph Font" w:uiPriority="1" w:semiHidden="1" w:unhideWhenUsed="1"/>
+    <w:lsdException w:name="Default Paragraph Font" w:semiHidden="1" w:uiPriority="1" w:unhideWhenUsed="1"/>
     <w:lsdException w:name="Body Text" w:semiHidden="1" w:unhideWhenUsed="1"/>
     <w:lsdException w:name="Body Text Indent" w:semiHidden="1" w:unhideWhenUsed="1"/>
     <w:lsdException w:name="List Continue" w:semiHidden="1" w:unhideWhenUsed="1"/>
@@ -1779,8 +1921,8 @@
     <w:lsdException w:name="Subtle Reference" w:uiPriority="31" w:qFormat="1"/>
     <w:lsdException w:name="Intense Reference" w:uiPriority="32" w:qFormat="1"/>
     <w:lsdException w:name="Book Title" w:uiPriority="33" w:qFormat="1"/>
-    <w:lsdException w:name="Bibliography" w:uiPriority="37" w:semiHidden="1" w:unhideWhenUsed="1"/>
-    <w:lsdException w:name="TOC Heading" w:uiPriority="39" w:semiHidden="1" w:unhideWhenUsed="1" w:qFormat="1"/>
+    <w:lsdException w:name="Bibliography" w:semiHidden="1" w:uiPriority="37" w:unhideWhenUsed="1"/>
+    <w:lsdException w:name="TOC Heading" w:semiHidden="1" w:uiPriority="39" w:unhideWhenUsed="1" w:qFormat="1"/>
     <w:lsdException w:name="Plain Table 1" w:uiPriority="41"/>
     <w:lsdException w:name="Plain Table 2" w:uiPriority="42"/>
     <w:lsdException w:name="Plain Table 3" w:uiPriority="43"/>
@@ -1891,7 +2033,7 @@
     <w:lsdException w:name="Unresolved Mention" w:semiHidden="1" w:unhideWhenUsed="1"/>
     <w:lsdException w:name="Smart Link" w:semiHidden="1" w:unhideWhenUsed="1"/>
   </w:latentStyles>
-  <w:style w:type="paragraph" w:styleId="Normal" w:default="1">
+  <w:style w:type="paragraph" w:default="1" w:styleId="Normal">
     <w:name w:val="Normal"/>
     <w:qFormat/>
   </w:style>
@@ -2008,13 +2150,13 @@
       <w:color w:val="666666"/>
     </w:rPr>
   </w:style>
-  <w:style w:type="character" w:styleId="DefaultParagraphFont" w:default="1">
+  <w:style w:type="character" w:default="1" w:styleId="DefaultParagraphFont">
     <w:name w:val="Default Paragraph Font"/>
     <w:uiPriority w:val="1"/>
     <w:semiHidden/>
     <w:unhideWhenUsed/>
   </w:style>
-  <w:style w:type="table" w:styleId="TableNormal" w:default="1">
+  <w:style w:type="table" w:default="1" w:styleId="TableNormal">
     <w:name w:val="Normal Table"/>
     <w:uiPriority w:val="99"/>
     <w:semiHidden/>
@@ -2029,13 +2171,13 @@
       </w:tblCellMar>
     </w:tblPr>
   </w:style>
-  <w:style w:type="numbering" w:styleId="NoList" w:default="1">
+  <w:style w:type="numbering" w:default="1" w:styleId="NoList">
     <w:name w:val="No List"/>
     <w:uiPriority w:val="99"/>
     <w:semiHidden/>
     <w:unhideWhenUsed/>
   </w:style>
-  <w:style w:type="table" w:styleId="TableNormal0" w:customStyle="1">
+  <w:style w:type="table" w:customStyle="1" w:styleId="TableNormal0">
     <w:name w:val="TableNormal"/>
     <w:tblPr>
       <w:tblCellMar>
@@ -2080,21 +2222,20 @@
     </w:rPr>
   </w:style>
   <w:style w:type="paragraph" w:styleId="ListParagraph">
-    <w:uiPriority w:val="34"/>
     <w:name w:val="List Paragraph"/>
     <w:basedOn w:val="Normal"/>
+    <w:uiPriority w:val="34"/>
     <w:qFormat/>
     <w:rsid w:val="54475823"/>
     <w:pPr>
-      <w:spacing/>
       <w:ind w:left="720"/>
       <w:contextualSpacing/>
     </w:pPr>
   </w:style>
   <w:style w:type="character" w:styleId="Hyperlink">
-    <w:uiPriority w:val="99"/>
     <w:name w:val="Hyperlink"/>
     <w:basedOn w:val="DefaultParagraphFont"/>
+    <w:uiPriority w:val="99"/>
     <w:unhideWhenUsed/>
     <w:rsid w:val="54475823"/>
     <w:rPr>

</xml_diff>